<commit_message>
Update: bổ sung phân tích BCTC
</commit_message>
<xml_diff>
--- a/FBAR2_2026_DNSE_Analysis.docx
+++ b/FBAR2_2026_DNSE_Analysis.docx
@@ -213,7 +213,7 @@
           <w:sz w:val="23"/>
           <w:szCs w:val="23"/>
         </w:rPr>
-        <w:t xml:space="preserve">The income statement shows what that costs. Operating revenue rose 58.9 per cent year on year in the first half of 2026 while the pre-tax profit margin fell from 23.2 per cent across 2025 to 13.3 per cent in the half year. Operating expenses rose 120 per cent in the first quarter of 2026 and provisions against the proprietary portfolio rose 405 per cent. At the half-year the firm had delivered 48.9 per cent of its revenue target and 20.6 per cent of its profit target.</w:t>
+        <w:t xml:space="preserve">The income statement shows what that costs. Operating revenue rose 59.0 per cent year on year in the first half of 2026 while the pre-tax profit margin fell from 23.3 per cent across 2025 to 13.2 per cent in the half year. Direct brokerage costs have exceeded brokerage commissions in each of the last 16 quarters, and operating expenses rose 120 per cent in the first quarter of 2026. At the half-year the firm had delivered 48.9 per cent of its revenue target and 20.3 per cent of its profit target.</w:t>
       </w:r>
     </w:p>
     <w:p>
@@ -720,7 +720,7 @@
           <w:sz w:val="23"/>
           <w:szCs w:val="23"/>
         </w:rPr>
-        <w:t xml:space="preserve">DNSE Securities Joint Stock Company is a Vietnamese securities firm listed on the Ho Chi Minh Stock Exchange under the code DSE. Its 2024 listing was the only initial public offering on the Vietnamese market that year. Charter capital stands at approximately VND 4,286 billion and total assets passed VND 15,000 billion at the end of 2025.</w:t>
+        <w:t xml:space="preserve">DNSE Securities Joint Stock Company is a Vietnamese securities firm listed on the Ho Chi Minh Stock Exchange under the code DSE. Its 2024 listing was the only initial public offering on the Vietnamese market that year. Charter capital stands at VND 4,282.5 billion and total assets reached VND 15,139 billion at the end of 2025.</w:t>
       </w:r>
     </w:p>
     <w:p>
@@ -750,7 +750,7 @@
           <w:sz w:val="23"/>
           <w:szCs w:val="23"/>
         </w:rPr>
-        <w:t xml:space="preserve">The market DNSE competes in is crowded and fragmenting. The ten largest firms accounted for 65.19 per cent of trading on the Ho Chi Minh exchange in the second quarter of 2026, down from 69.05 per cent three months earlier. Almost four percentage points of share moved to smaller firms in one quarter. Industry profit comes mainly from lending rather than from commissions, with VND 453,800 billion outstanding at the end of June 2026 against a regulatory cap of 200 per cent of equity. Pre-tax profit in that quarter ranged from VND 2,159 billion at VPBankS down to VND 98.9 billion at DNSE, which shows the scale difference between DNSE and the firms whose accounts it is winning.</w:t>
+        <w:t xml:space="preserve">The market DNSE competes in is crowded and fragmenting. The ten largest firms accounted for 65.19 per cent of trading on the Ho Chi Minh exchange in the second quarter of 2026, down from 69.05 per cent three months earlier. Almost four percentage points of share moved to smaller firms in one quarter. Industry profit comes mainly from lending rather than from commissions, with VND 453,800 billion outstanding at the end of June 2026 against a regulatory cap of 200 per cent of equity. Pre-tax profit in that quarter ranged from VND 2,159 billion at VPBankS down to VND 97.4 billion at DNSE, which shows the scale difference between DNSE and the firms whose accounts it is winning.</w:t>
       </w:r>
     </w:p>
     <w:p>
@@ -1092,7 +1092,7 @@
                 <w:sz w:val="18"/>
                 <w:szCs w:val="18"/>
               </w:rPr>
-              <w:t xml:space="preserve">Quarterly and half-year revenue, profit, revenue lines, lending balance, accounts, plan targets</w:t>
+              <w:t xml:space="preserve">Every line of the income statement, balance sheet, cash flow and notes; accounts and plan targets</w:t>
             </w:r>
           </w:p>
         </w:tc>
@@ -1119,7 +1119,7 @@
                 <w:sz w:val="18"/>
                 <w:szCs w:val="18"/>
               </w:rPr>
-              <w:t xml:space="preserve">DNSE investor relations disclosures and financial statements, FY2024 to Q2 2026</w:t>
+              <w:t xml:space="preserve">DNSE filed statements, Q1 2018 to Q2 2026, retrieved from Vietcap's data service 24 September 2026; investor relations releases</w:t>
             </w:r>
           </w:p>
         </w:tc>
@@ -3266,7 +3266,7 @@
           <w:sz w:val="23"/>
           <w:szCs w:val="23"/>
         </w:rPr>
-        <w:t xml:space="preserve">Revenue growth has continued while profitability has not. Operating revenue reached VND 1,467 billion in 2025, up 77 per cent, and VND 848.2 billion in the first half of 2026, up 58.9 per cent. Pre-tax profit moved differently, from VND 340.2 billion in 2025 to VND 113.1 billion in the first half of 2026. The pre-tax margin fell from 23.2 per cent to 13.3 per cent, and touched 3.6 per cent in the first quarter.</w:t>
+        <w:t xml:space="preserve">Revenue growth has continued while profitability has not. Operating revenue reached VND 1,457.9 billion in 2025, up 80.6 per cent, and VND 848.2 billion in the first half of 2026, up 59.0 per cent. Pre-tax profit moved differently, from VND 340.2 billion in 2025 to VND 111.6 billion in the first half of 2026. The pre-tax margin fell from 23.3 per cent to 13.2 per cent, and was 2.7 and 3.6 per cent in the two quarters to March 2026.</w:t>
       </w:r>
     </w:p>
     <w:p>
@@ -3329,7 +3329,7 @@
           <w:sz w:val="19"/>
           <w:szCs w:val="19"/>
         </w:rPr>
-        <w:t xml:space="preserve">Figure 7. Pre-tax profit margin by reporting period. The first quarter of 2026 carried a 120 per cent increase in operating expenses, a 125 per cent increase in brokerage costs and a 405 per cent increase in provisions against the proprietary portfolio.</w:t>
+        <w:t xml:space="preserve">Figure 7. Pre-tax profit margin by reporting period. In the first quarter of 2026 operating expenses rose 120 per cent and brokerage costs 125 per cent on a year earlier, and trading assets lost VND 9.6 billion net.</w:t>
       </w:r>
     </w:p>
     <w:p>
@@ -3344,7 +3344,7 @@
           <w:sz w:val="23"/>
           <w:szCs w:val="23"/>
         </w:rPr>
-        <w:t xml:space="preserve">The composition of revenue explains the exposure. Interest on lending and receivables contributed 39.6 per cent of first half revenue and investment income 22.8 per cent, so a majority of revenue depends on balance sheet size and market direction rather than on customer transactions. Brokerage commissions, at 26.2 per cent, come mostly from derivatives.</w:t>
+        <w:t xml:space="preserve">The composition of revenue explains the exposure. Interest on lending and receivables contributed 39.6 per cent of first half revenue, interest on held-to-maturity investments 22.8 per cent and gross trading gains 9.1 per cent, so 71.5 per cent of revenue depends on balance sheet size and market direction rather than on customer transactions. Brokerage commissions, at 26.2 per cent, come mostly from derivatives, and direct brokerage costs exceeded them by VND 44.5 billion in the half year.</w:t>
       </w:r>
     </w:p>
     <w:p>
@@ -3355,7 +3355,7 @@
       <w:r>
         <w:drawing>
           <wp:inline distT="0" distB="0" distL="0" distR="0">
-            <wp:extent cx="5191125" cy="1371600"/>
+            <wp:extent cx="5191125" cy="1476375"/>
             <wp:effectExtent t="0" r="0" b="0" l="0"/>
             <wp:docPr id="1" name="" descr="" title=""/>
             <wp:cNvGraphicFramePr>
@@ -3380,7 +3380,7 @@
                   <pic:spPr bwMode="auto">
                     <a:xfrm>
                       <a:off x="0" y="0"/>
-                      <a:ext cx="5191125" cy="1371600"/>
+                      <a:ext cx="5191125" cy="1476375"/>
                     </a:xfrm>
                     <a:prstGeom prst="rect">
                       <a:avLst/>
@@ -3422,7 +3422,7 @@
           <w:sz w:val="23"/>
           <w:szCs w:val="23"/>
         </w:rPr>
-        <w:t xml:space="preserve">Against plan the position is clear. DNSE targets VND 1,736 billion of revenue and VND 550 billion of pre-tax profit for 2026. The half-year delivered 48.9 per cent of the revenue target and 20.6 per cent of the profit target, so the second half must produce VND 436.9 billion of pre-tax profit, which is 3.9 times the first half.</w:t>
+        <w:t xml:space="preserve">Against plan the position is clear. DNSE targets VND 1,736 billion of revenue and VND 550 billion of pre-tax profit for 2026. The half-year delivered 48.9 per cent of the revenue target and 20.3 per cent of the profit target, so the second half must produce VND 438.4 billion of pre-tax profit, which is 3.9 times the first half.</w:t>
       </w:r>
     </w:p>
     <w:p>
@@ -5262,7 +5262,7 @@
           <w:sz w:val="23"/>
           <w:szCs w:val="23"/>
         </w:rPr>
-        <w:t xml:space="preserve">The scale of the prize can be stated from disclosed figures. Interest income of VND 336.1 billion in the first half of 2026 on an average lending balance of about VND 6,015 billion, the mean of the balances at the end of 2025 and of each quarter, implies a yield near 11 per cent a year. Raising the lending book by VND 1,000 billion, an increase of 16 per cent on the current balance, would add roughly VND 110 billion of annual interest income before funding costs. That is 20 per cent of the 2026 pre-tax profit target. Closing the full distance between DNSE's 1.39 per cent lending share and its 12.27 per cent account share would imply a book near VND 55,000 billion, which exceeds the firm's capital and is not a realistic target. The point is that even a small movement toward the account share is material.</w:t>
+        <w:t xml:space="preserve">The scale of the prize can be stated from the filed statements. Interest income of VND 336.1 billion in the first half of 2026 on an average lending balance of about VND 6,015 billion, the mean of the balances at the end of 2025 and of each quarter, implies a yield near 11 per cent a year, against an estimated funding cost of 6.3 per cent. Raising the lending book by VND 1,000 billion, an increase of 16 per cent, would add roughly VND 112 billion of annual interest income, or about VND 49 billion after funding costs, which is 9 per cent of the 2026 pre-tax profit target. Closing the full distance between DNSE's 1.39 per cent lending share and its 12.27 per cent account share would imply a book near VND 55,000 billion, which exceeds the firm's capital and is not a realistic target. The point is that even a small movement toward the account share is material.</w:t>
       </w:r>
     </w:p>
     <w:p>
@@ -5277,7 +5277,7 @@
           <w:sz w:val="23"/>
           <w:szCs w:val="23"/>
         </w:rPr>
-        <w:t xml:space="preserve">Derivatives concentration ranks second. The effect is large, since a quarter of brokerage revenue would be exposed to a regulatory or volatility shock, and the evidence is strong because the share series is published. It ranks below revenue per account because DNSE cannot control the structure of the derivatives market. Proprietary trading volatility ranks third. Provisions rising 405 per cent in one quarter is a real signal, and risk limits are adjustable, but one quarter is a thin evidentiary base and the exposure is smaller than the other two.</w:t>
+        <w:t xml:space="preserve">Derivatives concentration ranks second. The effect is large, since a quarter of brokerage revenue would be exposed to a regulatory or volatility shock, and the evidence is strong because the share series is published. It ranks below revenue per account because DNSE cannot control the structure of the derivatives market. Proprietary trading volatility ranks third. Net trading losses in the two quarters to March 2026 are a real signal, and risk limits are adjustable, but two quarters is a thin evidentiary base and the exposure is smaller than the other two.</w:t>
       </w:r>
     </w:p>
     <w:tbl>
@@ -5779,7 +5779,7 @@
                 <w:sz w:val="18"/>
                 <w:szCs w:val="18"/>
               </w:rPr>
-              <w:t xml:space="preserve">Medium. Provisions rose 405 per cent in one quarter</w:t>
+              <w:t xml:space="preserve">Medium. Trading assets lost money net in two consecutive quarters</w:t>
             </w:r>
           </w:p>
         </w:tc>
@@ -5833,7 +5833,7 @@
                 <w:sz w:val="18"/>
                 <w:szCs w:val="18"/>
               </w:rPr>
-              <w:t xml:space="preserve">Moderate. One quarter of evidence</w:t>
+              <w:t xml:space="preserve">Moderate. Two quarters of evidence</w:t>
             </w:r>
           </w:p>
         </w:tc>
@@ -6694,7 +6694,7 @@
           <w:sz w:val="23"/>
           <w:szCs w:val="23"/>
         </w:rPr>
-        <w:t xml:space="preserve">Estimate the lending response. The link from on-platform assets to margin balances is the core of the recommendation. Regressing historical margin balances on customer assets, using the disclosed series, would size the effect and test whether the 200 per cent regulatory cap binds before the commercial opportunity is exhausted.</w:t>
+        <w:t xml:space="preserve">Estimate the lending response. The link from on-platform assets to margin balances is the core of the recommendation. Regressing historical margin balances on customer assets, using the disclosed series, would size the effect; with lending at 116 per cent of equity, the 200 per cent regulatory cap is not yet the constraint.</w:t>
       </w:r>
     </w:p>
     <w:p>
@@ -6745,7 +6745,7 @@
           <w:sz w:val="23"/>
           <w:szCs w:val="23"/>
         </w:rPr>
-        <w:t xml:space="preserve">DNSE built an acquisition engine that works and a monetisation engine that has not kept pace. It holds one eighth of Vietnam's securities accounts, a quarter of the derivatives market, under three per cent of cash equity trading and 1.39 per cent of industry lending. The gap between those numbers is the business problem, and it is visible in a pre-tax margin that fell from 23.2 per cent to 13.3 per cent while revenue grew 59 per cent. The Findex evidence shows that the adults who hold investable savings are the ones already transacting digitally, and that their savings are now accumulating quickly. Converting existing accounts into funded accounts addresses the constraint using a mandate the firm already holds.</w:t>
+        <w:t xml:space="preserve">DNSE built an acquisition engine that works and a monetisation engine that has not kept pace. It holds one eighth of Vietnam's securities accounts, a quarter of the derivatives market, under three per cent of cash equity trading and 1.39 per cent of industry lending. The gap between those numbers is the business problem, and it is visible in a pre-tax margin that fell from 23.3 per cent to 13.2 per cent while revenue grew 59 per cent. The Findex evidence shows that the adults who hold investable savings are the ones already transacting digitally, and that their savings are now accumulating quickly. Converting existing accounts into funded accounts addresses the constraint using a mandate the firm already holds.</w:t>
       </w:r>
     </w:p>
     <w:p>
@@ -7012,7 +7012,7 @@
                 <w:sz w:val="18"/>
                 <w:szCs w:val="18"/>
               </w:rPr>
-              <w:t xml:space="preserve">1,467.0</w:t>
+              <w:t xml:space="preserve">1,457.9</w:t>
             </w:r>
           </w:p>
         </w:tc>
@@ -7039,7 +7039,7 @@
                 <w:sz w:val="18"/>
                 <w:szCs w:val="18"/>
               </w:rPr>
-              <w:t xml:space="preserve">395.0</w:t>
+              <w:t xml:space="preserve">395.1</w:t>
             </w:r>
           </w:p>
         </w:tc>
@@ -7396,7 +7396,7 @@
                 <w:sz w:val="18"/>
                 <w:szCs w:val="18"/>
               </w:rPr>
-              <w:t xml:space="preserve">Investment income</w:t>
+              <w:t xml:space="preserve">Brokerage direct costs</w:t>
             </w:r>
           </w:p>
         </w:tc>
@@ -7423,7 +7423,7 @@
                 <w:sz w:val="18"/>
                 <w:szCs w:val="18"/>
               </w:rPr>
-              <w:t xml:space="preserve">171.4</w:t>
+              <w:t xml:space="preserve">-464.9</w:t>
             </w:r>
           </w:p>
         </w:tc>
@@ -7450,7 +7450,7 @@
                 <w:sz w:val="18"/>
                 <w:szCs w:val="18"/>
               </w:rPr>
-              <w:t xml:space="preserve">98.4</w:t>
+              <w:t xml:space="preserve">-137.8</w:t>
             </w:r>
           </w:p>
         </w:tc>
@@ -7477,7 +7477,7 @@
                 <w:sz w:val="18"/>
                 <w:szCs w:val="18"/>
               </w:rPr>
-              <w:t xml:space="preserve">95.0</w:t>
+              <w:t xml:space="preserve">-128.7</w:t>
             </w:r>
           </w:p>
         </w:tc>
@@ -7504,7 +7504,7 @@
                 <w:sz w:val="18"/>
                 <w:szCs w:val="18"/>
               </w:rPr>
-              <w:t xml:space="preserve">193.4</w:t>
+              <w:t xml:space="preserve">-266.5</w:t>
             </w:r>
           </w:p>
         </w:tc>
@@ -7533,7 +7533,7 @@
                 <w:sz w:val="18"/>
                 <w:szCs w:val="18"/>
               </w:rPr>
-              <w:t xml:space="preserve">Pre-tax profit</w:t>
+              <w:t xml:space="preserve">Interest on held-to-maturity investments</w:t>
             </w:r>
           </w:p>
         </w:tc>
@@ -7560,7 +7560,7 @@
                 <w:sz w:val="18"/>
                 <w:szCs w:val="18"/>
               </w:rPr>
-              <w:t xml:space="preserve">340.2</w:t>
+              <w:t xml:space="preserve">303.9</w:t>
             </w:r>
           </w:p>
         </w:tc>
@@ -7587,7 +7587,7 @@
                 <w:sz w:val="18"/>
                 <w:szCs w:val="18"/>
               </w:rPr>
-              <w:t xml:space="preserve">14.2</w:t>
+              <w:t xml:space="preserve">98.4</w:t>
             </w:r>
           </w:p>
         </w:tc>
@@ -7614,7 +7614,7 @@
                 <w:sz w:val="18"/>
                 <w:szCs w:val="18"/>
               </w:rPr>
-              <w:t xml:space="preserve">98.9</w:t>
+              <w:t xml:space="preserve">95.0</w:t>
             </w:r>
           </w:p>
         </w:tc>
@@ -7641,7 +7641,7 @@
                 <w:sz w:val="18"/>
                 <w:szCs w:val="18"/>
               </w:rPr>
-              <w:t xml:space="preserve">113.1</w:t>
+              <w:t xml:space="preserve">193.4</w:t>
             </w:r>
           </w:p>
         </w:tc>
@@ -7670,7 +7670,7 @@
                 <w:sz w:val="18"/>
                 <w:szCs w:val="18"/>
               </w:rPr>
-              <w:t xml:space="preserve">Profit after tax</w:t>
+              <w:t xml:space="preserve">Gross trading gains</w:t>
             </w:r>
           </w:p>
         </w:tc>
@@ -7697,7 +7697,7 @@
                 <w:sz w:val="18"/>
                 <w:szCs w:val="18"/>
               </w:rPr>
-              <w:t xml:space="preserve">272.5</w:t>
+              <w:t xml:space="preserve">171.4</w:t>
             </w:r>
           </w:p>
         </w:tc>
@@ -7724,7 +7724,7 @@
                 <w:sz w:val="18"/>
                 <w:szCs w:val="18"/>
               </w:rPr>
-              <w:t xml:space="preserve">11.3</w:t>
+              <w:t xml:space="preserve">23.5</w:t>
             </w:r>
           </w:p>
         </w:tc>
@@ -7751,7 +7751,7 @@
                 <w:sz w:val="18"/>
                 <w:szCs w:val="18"/>
               </w:rPr>
-              <w:t xml:space="preserve">83.0</w:t>
+              <w:t xml:space="preserve">53.8</w:t>
             </w:r>
           </w:p>
         </w:tc>
@@ -7778,7 +7778,7 @@
                 <w:sz w:val="18"/>
                 <w:szCs w:val="18"/>
               </w:rPr>
-              <w:t xml:space="preserve">94.3</w:t>
+              <w:t xml:space="preserve">77.2</w:t>
             </w:r>
           </w:p>
         </w:tc>
@@ -7807,7 +7807,7 @@
                 <w:sz w:val="18"/>
                 <w:szCs w:val="18"/>
               </w:rPr>
-              <w:t xml:space="preserve">Pre-tax margin, per cent</w:t>
+              <w:t xml:space="preserve">Pre-tax profit</w:t>
             </w:r>
           </w:p>
         </w:tc>
@@ -7834,7 +7834,7 @@
                 <w:sz w:val="18"/>
                 <w:szCs w:val="18"/>
               </w:rPr>
-              <w:t xml:space="preserve">23.2</w:t>
+              <w:t xml:space="preserve">340.2</w:t>
             </w:r>
           </w:p>
         </w:tc>
@@ -7861,7 +7861,7 @@
                 <w:sz w:val="18"/>
                 <w:szCs w:val="18"/>
               </w:rPr>
-              <w:t xml:space="preserve">3.6</w:t>
+              <w:t xml:space="preserve">14.2</w:t>
             </w:r>
           </w:p>
         </w:tc>
@@ -7888,7 +7888,7 @@
                 <w:sz w:val="18"/>
                 <w:szCs w:val="18"/>
               </w:rPr>
-              <w:t xml:space="preserve">21.8</w:t>
+              <w:t xml:space="preserve">97.4</w:t>
             </w:r>
           </w:p>
         </w:tc>
@@ -7915,7 +7915,7 @@
                 <w:sz w:val="18"/>
                 <w:szCs w:val="18"/>
               </w:rPr>
-              <w:t xml:space="preserve">13.3</w:t>
+              <w:t xml:space="preserve">111.6</w:t>
             </w:r>
           </w:p>
         </w:tc>
@@ -7944,6 +7944,280 @@
                 <w:sz w:val="18"/>
                 <w:szCs w:val="18"/>
               </w:rPr>
+              <w:t xml:space="preserve">Profit after tax</w:t>
+            </w:r>
+          </w:p>
+        </w:tc>
+        <w:tc>
+          <w:tcPr>
+            <w:tcW w:type="dxa" w:w="1620"/>
+            <w:tcMar>
+              <w:top w:type="dxa" w:w="70"/>
+              <w:left w:type="dxa" w:w="100"/>
+              <w:bottom w:type="dxa" w:w="70"/>
+              <w:right w:type="dxa" w:w="100"/>
+            </w:tcMar>
+            <w:vAlign w:val="center"/>
+          </w:tcPr>
+          <w:p>
+            <w:pPr>
+              <w:spacing w:after="0" w:line="260"/>
+              <w:jc w:val="right"/>
+            </w:pPr>
+            <w:r>
+              <w:rPr>
+                <w:rFonts w:ascii="Times New Roman" w:cs="Times New Roman" w:eastAsia="Times New Roman" w:hAnsi="Times New Roman"/>
+                <w:color w:val="000000"/>
+                <w:sz w:val="18"/>
+                <w:szCs w:val="18"/>
+              </w:rPr>
+              <w:t xml:space="preserve">272.5</w:t>
+            </w:r>
+          </w:p>
+        </w:tc>
+        <w:tc>
+          <w:tcPr>
+            <w:tcW w:type="dxa" w:w="1620"/>
+            <w:tcMar>
+              <w:top w:type="dxa" w:w="70"/>
+              <w:left w:type="dxa" w:w="100"/>
+              <w:bottom w:type="dxa" w:w="70"/>
+              <w:right w:type="dxa" w:w="100"/>
+            </w:tcMar>
+            <w:vAlign w:val="center"/>
+          </w:tcPr>
+          <w:p>
+            <w:pPr>
+              <w:spacing w:after="0" w:line="260"/>
+              <w:jc w:val="right"/>
+            </w:pPr>
+            <w:r>
+              <w:rPr>
+                <w:rFonts w:ascii="Times New Roman" w:cs="Times New Roman" w:eastAsia="Times New Roman" w:hAnsi="Times New Roman"/>
+                <w:color w:val="000000"/>
+                <w:sz w:val="18"/>
+                <w:szCs w:val="18"/>
+              </w:rPr>
+              <w:t xml:space="preserve">11.3</w:t>
+            </w:r>
+          </w:p>
+        </w:tc>
+        <w:tc>
+          <w:tcPr>
+            <w:tcW w:type="dxa" w:w="1620"/>
+            <w:tcMar>
+              <w:top w:type="dxa" w:w="70"/>
+              <w:left w:type="dxa" w:w="100"/>
+              <w:bottom w:type="dxa" w:w="70"/>
+              <w:right w:type="dxa" w:w="100"/>
+            </w:tcMar>
+            <w:vAlign w:val="center"/>
+          </w:tcPr>
+          <w:p>
+            <w:pPr>
+              <w:spacing w:after="0" w:line="260"/>
+              <w:jc w:val="right"/>
+            </w:pPr>
+            <w:r>
+              <w:rPr>
+                <w:rFonts w:ascii="Times New Roman" w:cs="Times New Roman" w:eastAsia="Times New Roman" w:hAnsi="Times New Roman"/>
+                <w:color w:val="000000"/>
+                <w:sz w:val="18"/>
+                <w:szCs w:val="18"/>
+              </w:rPr>
+              <w:t xml:space="preserve">81.8</w:t>
+            </w:r>
+          </w:p>
+        </w:tc>
+        <w:tc>
+          <w:tcPr>
+            <w:tcW w:type="dxa" w:w="1660"/>
+            <w:tcMar>
+              <w:top w:type="dxa" w:w="70"/>
+              <w:left w:type="dxa" w:w="100"/>
+              <w:bottom w:type="dxa" w:w="70"/>
+              <w:right w:type="dxa" w:w="100"/>
+            </w:tcMar>
+            <w:vAlign w:val="center"/>
+          </w:tcPr>
+          <w:p>
+            <w:pPr>
+              <w:spacing w:after="0" w:line="260"/>
+              <w:jc w:val="right"/>
+            </w:pPr>
+            <w:r>
+              <w:rPr>
+                <w:rFonts w:ascii="Times New Roman" w:cs="Times New Roman" w:eastAsia="Times New Roman" w:hAnsi="Times New Roman"/>
+                <w:color w:val="000000"/>
+                <w:sz w:val="18"/>
+                <w:szCs w:val="18"/>
+              </w:rPr>
+              <w:t xml:space="preserve">93.1</w:t>
+            </w:r>
+          </w:p>
+        </w:tc>
+      </w:tr>
+      <w:tr>
+        <w:tc>
+          <w:tcPr>
+            <w:tcW w:type="dxa" w:w="2500"/>
+            <w:tcMar>
+              <w:top w:type="dxa" w:w="70"/>
+              <w:left w:type="dxa" w:w="100"/>
+              <w:bottom w:type="dxa" w:w="70"/>
+              <w:right w:type="dxa" w:w="100"/>
+            </w:tcMar>
+            <w:vAlign w:val="center"/>
+          </w:tcPr>
+          <w:p>
+            <w:pPr>
+              <w:spacing w:after="0" w:line="260"/>
+              <w:jc w:val="left"/>
+            </w:pPr>
+            <w:r>
+              <w:rPr>
+                <w:rFonts w:ascii="Times New Roman" w:cs="Times New Roman" w:eastAsia="Times New Roman" w:hAnsi="Times New Roman"/>
+                <w:color w:val="000000"/>
+                <w:sz w:val="18"/>
+                <w:szCs w:val="18"/>
+              </w:rPr>
+              <w:t xml:space="preserve">Pre-tax margin, per cent</w:t>
+            </w:r>
+          </w:p>
+        </w:tc>
+        <w:tc>
+          <w:tcPr>
+            <w:tcW w:type="dxa" w:w="1620"/>
+            <w:tcMar>
+              <w:top w:type="dxa" w:w="70"/>
+              <w:left w:type="dxa" w:w="100"/>
+              <w:bottom w:type="dxa" w:w="70"/>
+              <w:right w:type="dxa" w:w="100"/>
+            </w:tcMar>
+            <w:vAlign w:val="center"/>
+          </w:tcPr>
+          <w:p>
+            <w:pPr>
+              <w:spacing w:after="0" w:line="260"/>
+              <w:jc w:val="right"/>
+            </w:pPr>
+            <w:r>
+              <w:rPr>
+                <w:rFonts w:ascii="Times New Roman" w:cs="Times New Roman" w:eastAsia="Times New Roman" w:hAnsi="Times New Roman"/>
+                <w:color w:val="000000"/>
+                <w:sz w:val="18"/>
+                <w:szCs w:val="18"/>
+              </w:rPr>
+              <w:t xml:space="preserve">23.3</w:t>
+            </w:r>
+          </w:p>
+        </w:tc>
+        <w:tc>
+          <w:tcPr>
+            <w:tcW w:type="dxa" w:w="1620"/>
+            <w:tcMar>
+              <w:top w:type="dxa" w:w="70"/>
+              <w:left w:type="dxa" w:w="100"/>
+              <w:bottom w:type="dxa" w:w="70"/>
+              <w:right w:type="dxa" w:w="100"/>
+            </w:tcMar>
+            <w:vAlign w:val="center"/>
+          </w:tcPr>
+          <w:p>
+            <w:pPr>
+              <w:spacing w:after="0" w:line="260"/>
+              <w:jc w:val="right"/>
+            </w:pPr>
+            <w:r>
+              <w:rPr>
+                <w:rFonts w:ascii="Times New Roman" w:cs="Times New Roman" w:eastAsia="Times New Roman" w:hAnsi="Times New Roman"/>
+                <w:color w:val="000000"/>
+                <w:sz w:val="18"/>
+                <w:szCs w:val="18"/>
+              </w:rPr>
+              <w:t xml:space="preserve">3.6</w:t>
+            </w:r>
+          </w:p>
+        </w:tc>
+        <w:tc>
+          <w:tcPr>
+            <w:tcW w:type="dxa" w:w="1620"/>
+            <w:tcMar>
+              <w:top w:type="dxa" w:w="70"/>
+              <w:left w:type="dxa" w:w="100"/>
+              <w:bottom w:type="dxa" w:w="70"/>
+              <w:right w:type="dxa" w:w="100"/>
+            </w:tcMar>
+            <w:vAlign w:val="center"/>
+          </w:tcPr>
+          <w:p>
+            <w:pPr>
+              <w:spacing w:after="0" w:line="260"/>
+              <w:jc w:val="right"/>
+            </w:pPr>
+            <w:r>
+              <w:rPr>
+                <w:rFonts w:ascii="Times New Roman" w:cs="Times New Roman" w:eastAsia="Times New Roman" w:hAnsi="Times New Roman"/>
+                <w:color w:val="000000"/>
+                <w:sz w:val="18"/>
+                <w:szCs w:val="18"/>
+              </w:rPr>
+              <w:t xml:space="preserve">21.5</w:t>
+            </w:r>
+          </w:p>
+        </w:tc>
+        <w:tc>
+          <w:tcPr>
+            <w:tcW w:type="dxa" w:w="1660"/>
+            <w:tcMar>
+              <w:top w:type="dxa" w:w="70"/>
+              <w:left w:type="dxa" w:w="100"/>
+              <w:bottom w:type="dxa" w:w="70"/>
+              <w:right w:type="dxa" w:w="100"/>
+            </w:tcMar>
+            <w:vAlign w:val="center"/>
+          </w:tcPr>
+          <w:p>
+            <w:pPr>
+              <w:spacing w:after="0" w:line="260"/>
+              <w:jc w:val="right"/>
+            </w:pPr>
+            <w:r>
+              <w:rPr>
+                <w:rFonts w:ascii="Times New Roman" w:cs="Times New Roman" w:eastAsia="Times New Roman" w:hAnsi="Times New Roman"/>
+                <w:color w:val="000000"/>
+                <w:sz w:val="18"/>
+                <w:szCs w:val="18"/>
+              </w:rPr>
+              <w:t xml:space="preserve">13.2</w:t>
+            </w:r>
+          </w:p>
+        </w:tc>
+      </w:tr>
+      <w:tr>
+        <w:tc>
+          <w:tcPr>
+            <w:tcW w:type="dxa" w:w="2500"/>
+            <w:tcMar>
+              <w:top w:type="dxa" w:w="70"/>
+              <w:left w:type="dxa" w:w="100"/>
+              <w:bottom w:type="dxa" w:w="70"/>
+              <w:right w:type="dxa" w:w="100"/>
+            </w:tcMar>
+            <w:vAlign w:val="center"/>
+          </w:tcPr>
+          <w:p>
+            <w:pPr>
+              <w:spacing w:after="0" w:line="260"/>
+              <w:jc w:val="left"/>
+            </w:pPr>
+            <w:r>
+              <w:rPr>
+                <w:rFonts w:ascii="Times New Roman" w:cs="Times New Roman" w:eastAsia="Times New Roman" w:hAnsi="Times New Roman"/>
+                <w:color w:val="000000"/>
+                <w:sz w:val="18"/>
+                <w:szCs w:val="18"/>
+              </w:rPr>
               <w:t xml:space="preserve">Margin loans and advances</w:t>
             </w:r>
           </w:p>
@@ -8053,6 +8327,143 @@
                 <w:szCs w:val="18"/>
               </w:rPr>
               <w:t xml:space="preserve">6,303</w:t>
+            </w:r>
+          </w:p>
+        </w:tc>
+      </w:tr>
+      <w:tr>
+        <w:tc>
+          <w:tcPr>
+            <w:tcW w:type="dxa" w:w="2500"/>
+            <w:tcMar>
+              <w:top w:type="dxa" w:w="70"/>
+              <w:left w:type="dxa" w:w="100"/>
+              <w:bottom w:type="dxa" w:w="70"/>
+              <w:right w:type="dxa" w:w="100"/>
+            </w:tcMar>
+            <w:vAlign w:val="center"/>
+          </w:tcPr>
+          <w:p>
+            <w:pPr>
+              <w:spacing w:after="0" w:line="260"/>
+              <w:jc w:val="left"/>
+            </w:pPr>
+            <w:r>
+              <w:rPr>
+                <w:rFonts w:ascii="Times New Roman" w:cs="Times New Roman" w:eastAsia="Times New Roman" w:hAnsi="Times New Roman"/>
+                <w:color w:val="000000"/>
+                <w:sz w:val="18"/>
+                <w:szCs w:val="18"/>
+              </w:rPr>
+              <w:t xml:space="preserve">Shareholders' equity</w:t>
+            </w:r>
+          </w:p>
+        </w:tc>
+        <w:tc>
+          <w:tcPr>
+            <w:tcW w:type="dxa" w:w="1620"/>
+            <w:tcMar>
+              <w:top w:type="dxa" w:w="70"/>
+              <w:left w:type="dxa" w:w="100"/>
+              <w:bottom w:type="dxa" w:w="70"/>
+              <w:right w:type="dxa" w:w="100"/>
+            </w:tcMar>
+            <w:vAlign w:val="center"/>
+          </w:tcPr>
+          <w:p>
+            <w:pPr>
+              <w:spacing w:after="0" w:line="260"/>
+              <w:jc w:val="right"/>
+            </w:pPr>
+            <w:r>
+              <w:rPr>
+                <w:rFonts w:ascii="Times New Roman" w:cs="Times New Roman" w:eastAsia="Times New Roman" w:hAnsi="Times New Roman"/>
+                <w:color w:val="000000"/>
+                <w:sz w:val="18"/>
+                <w:szCs w:val="18"/>
+              </w:rPr>
+              <w:t xml:space="preserve">4,302</w:t>
+            </w:r>
+          </w:p>
+        </w:tc>
+        <w:tc>
+          <w:tcPr>
+            <w:tcW w:type="dxa" w:w="1620"/>
+            <w:tcMar>
+              <w:top w:type="dxa" w:w="70"/>
+              <w:left w:type="dxa" w:w="100"/>
+              <w:bottom w:type="dxa" w:w="70"/>
+              <w:right w:type="dxa" w:w="100"/>
+            </w:tcMar>
+            <w:vAlign w:val="center"/>
+          </w:tcPr>
+          <w:p>
+            <w:pPr>
+              <w:spacing w:after="0" w:line="260"/>
+              <w:jc w:val="right"/>
+            </w:pPr>
+            <w:r>
+              <w:rPr>
+                <w:rFonts w:ascii="Times New Roman" w:cs="Times New Roman" w:eastAsia="Times New Roman" w:hAnsi="Times New Roman"/>
+                <w:color w:val="000000"/>
+                <w:sz w:val="18"/>
+                <w:szCs w:val="18"/>
+              </w:rPr>
+              <w:t xml:space="preserve">5,358</w:t>
+            </w:r>
+          </w:p>
+        </w:tc>
+        <w:tc>
+          <w:tcPr>
+            <w:tcW w:type="dxa" w:w="1620"/>
+            <w:tcMar>
+              <w:top w:type="dxa" w:w="70"/>
+              <w:left w:type="dxa" w:w="100"/>
+              <w:bottom w:type="dxa" w:w="70"/>
+              <w:right w:type="dxa" w:w="100"/>
+            </w:tcMar>
+            <w:vAlign w:val="center"/>
+          </w:tcPr>
+          <w:p>
+            <w:pPr>
+              <w:spacing w:after="0" w:line="260"/>
+              <w:jc w:val="right"/>
+            </w:pPr>
+            <w:r>
+              <w:rPr>
+                <w:rFonts w:ascii="Times New Roman" w:cs="Times New Roman" w:eastAsia="Times New Roman" w:hAnsi="Times New Roman"/>
+                <w:color w:val="000000"/>
+                <w:sz w:val="18"/>
+                <w:szCs w:val="18"/>
+              </w:rPr>
+              <w:t xml:space="preserve">5,440</w:t>
+            </w:r>
+          </w:p>
+        </w:tc>
+        <w:tc>
+          <w:tcPr>
+            <w:tcW w:type="dxa" w:w="1660"/>
+            <w:tcMar>
+              <w:top w:type="dxa" w:w="70"/>
+              <w:left w:type="dxa" w:w="100"/>
+              <w:bottom w:type="dxa" w:w="70"/>
+              <w:right w:type="dxa" w:w="100"/>
+            </w:tcMar>
+            <w:vAlign w:val="center"/>
+          </w:tcPr>
+          <w:p>
+            <w:pPr>
+              <w:spacing w:after="0" w:line="260"/>
+              <w:jc w:val="right"/>
+            </w:pPr>
+            <w:r>
+              <w:rPr>
+                <w:rFonts w:ascii="Times New Roman" w:cs="Times New Roman" w:eastAsia="Times New Roman" w:hAnsi="Times New Roman"/>
+                <w:color w:val="000000"/>
+                <w:sz w:val="18"/>
+                <w:szCs w:val="18"/>
+              </w:rPr>
+              <w:t xml:space="preserve">5,440</w:t>
             </w:r>
           </w:p>
         </w:tc>
@@ -8346,7 +8757,7 @@
           <w:sz w:val="19"/>
           <w:szCs w:val="19"/>
         </w:rPr>
-        <w:t xml:space="preserve">Table A1. Sources are DNSE quarterly financial statements and investor relations releases.</w:t>
+        <w:t xml:space="preserve">Table A1. DNSE filed statements, retrieved from Vietcap's data service by step 01b; costs are negative. The second quarter of 2026 is the KPMG-reviewed half year less the first quarter. Accounts and new-account shares are from investor relations releases.</w:t>
       </w:r>
     </w:p>
     <w:p>
@@ -17588,6 +17999,118 @@
                 <w:szCs w:val="18"/>
               </w:rPr>
               <w:t xml:space="preserve">https://www.dnse.com.vn/quan-he-nha-dau-tu</w:t>
+            </w:r>
+          </w:p>
+        </w:tc>
+      </w:tr>
+      <w:tr>
+        <w:tc>
+          <w:tcPr>
+            <w:tcW w:type="dxa" w:w="2700"/>
+            <w:tcMar>
+              <w:top w:type="dxa" w:w="70"/>
+              <w:left w:type="dxa" w:w="100"/>
+              <w:bottom w:type="dxa" w:w="70"/>
+              <w:right w:type="dxa" w:w="100"/>
+            </w:tcMar>
+            <w:vAlign w:val="center"/>
+          </w:tcPr>
+          <w:p>
+            <w:pPr>
+              <w:spacing w:after="0" w:line="260"/>
+              <w:jc w:val="left"/>
+            </w:pPr>
+            <w:r>
+              <w:rPr>
+                <w:rFonts w:ascii="Times New Roman" w:cs="Times New Roman" w:eastAsia="Times New Roman" w:hAnsi="Times New Roman"/>
+                <w:color w:val="000000"/>
+                <w:sz w:val="18"/>
+                <w:szCs w:val="18"/>
+              </w:rPr>
+              <w:t xml:space="preserve">DNSE financial statements</w:t>
+            </w:r>
+          </w:p>
+        </w:tc>
+        <w:tc>
+          <w:tcPr>
+            <w:tcW w:type="dxa" w:w="6320"/>
+            <w:tcMar>
+              <w:top w:type="dxa" w:w="70"/>
+              <w:left w:type="dxa" w:w="100"/>
+              <w:bottom w:type="dxa" w:w="70"/>
+              <w:right w:type="dxa" w:w="100"/>
+            </w:tcMar>
+            <w:vAlign w:val="center"/>
+          </w:tcPr>
+          <w:p>
+            <w:pPr>
+              <w:spacing w:after="0" w:line="260"/>
+              <w:jc w:val="left"/>
+            </w:pPr>
+            <w:r>
+              <w:rPr>
+                <w:rFonts w:ascii="Times New Roman" w:cs="Times New Roman" w:eastAsia="Times New Roman" w:hAnsi="Times New Roman"/>
+                <w:color w:val="000000"/>
+                <w:sz w:val="18"/>
+                <w:szCs w:val="18"/>
+              </w:rPr>
+              <w:t xml:space="preserve">https://ir.dnse.com.vn/vi/ctype-finance_report</w:t>
+            </w:r>
+          </w:p>
+        </w:tc>
+      </w:tr>
+      <w:tr>
+        <w:tc>
+          <w:tcPr>
+            <w:tcW w:type="dxa" w:w="2700"/>
+            <w:tcMar>
+              <w:top w:type="dxa" w:w="70"/>
+              <w:left w:type="dxa" w:w="100"/>
+              <w:bottom w:type="dxa" w:w="70"/>
+              <w:right w:type="dxa" w:w="100"/>
+            </w:tcMar>
+            <w:vAlign w:val="center"/>
+          </w:tcPr>
+          <w:p>
+            <w:pPr>
+              <w:spacing w:after="0" w:line="260"/>
+              <w:jc w:val="left"/>
+            </w:pPr>
+            <w:r>
+              <w:rPr>
+                <w:rFonts w:ascii="Times New Roman" w:cs="Times New Roman" w:eastAsia="Times New Roman" w:hAnsi="Times New Roman"/>
+                <w:color w:val="000000"/>
+                <w:sz w:val="18"/>
+                <w:szCs w:val="18"/>
+              </w:rPr>
+              <w:t xml:space="preserve">DNSE statements, every line</w:t>
+            </w:r>
+          </w:p>
+        </w:tc>
+        <w:tc>
+          <w:tcPr>
+            <w:tcW w:type="dxa" w:w="6320"/>
+            <w:tcMar>
+              <w:top w:type="dxa" w:w="70"/>
+              <w:left w:type="dxa" w:w="100"/>
+              <w:bottom w:type="dxa" w:w="70"/>
+              <w:right w:type="dxa" w:w="100"/>
+            </w:tcMar>
+            <w:vAlign w:val="center"/>
+          </w:tcPr>
+          <w:p>
+            <w:pPr>
+              <w:spacing w:after="0" w:line="260"/>
+              <w:jc w:val="left"/>
+            </w:pPr>
+            <w:r>
+              <w:rPr>
+                <w:rFonts w:ascii="Times New Roman" w:cs="Times New Roman" w:eastAsia="Times New Roman" w:hAnsi="Times New Roman"/>
+                <w:color w:val="000000"/>
+                <w:sz w:val="18"/>
+                <w:szCs w:val="18"/>
+              </w:rPr>
+              <w:t xml:space="preserve">https://iq.vietcap.com.vn/api/iq-insight-service/v1/company/DSE/financial-statement</w:t>
             </w:r>
           </w:p>
         </w:tc>
@@ -21813,7 +22336,26 @@
           <w:sz w:val="23"/>
           <w:szCs w:val="23"/>
         </w:rPr>
-        <w:t xml:space="preserve">Half-year operating revenue is VND 848.2 billion, which reconciles with the two quarterly figures of VND 395.0 billion and VND 453.1 billion to within rounding.</w:t>
+        <w:t xml:space="preserve">Half-year figures add the two quarters for income and take the 30 June balance for stocks. The second quarter is the KPMG-reviewed half year less the first quarter, so its pre-tax profit of VND 97.4 billion is below the VND 98.9 billion first reported on 20 July 2026.</w:t>
+      </w:r>
+    </w:p>
+    <w:p>
+      <w:pPr>
+        <w:pStyle w:val="ListParagraph"/>
+        <w:numPr>
+          <w:ilvl w:val="0"/>
+          <w:numId w:val="3"/>
+        </w:numPr>
+        <w:spacing w:after="90" w:line="300"/>
+      </w:pPr>
+      <w:r>
+        <w:rPr>
+          <w:rFonts w:ascii="Times New Roman" w:cs="Times New Roman" w:eastAsia="Times New Roman" w:hAnsi="Times New Roman"/>
+          <w:color w:val="000000"/>
+          <w:sz w:val="23"/>
+          <w:szCs w:val="23"/>
+        </w:rPr>
+        <w:t xml:space="preserve">Funding cost is estimated as interest expense plus template line 24 less the rise in the loan-loss allowance, because the securities-company template reports loan-loss provisions and the borrowing cost of the loan book as one line.</w:t>
       </w:r>
     </w:p>
     <w:p>
@@ -21936,7 +22478,7 @@
           <w:sz w:val="23"/>
           <w:szCs w:val="23"/>
         </w:rPr>
-        <w:t xml:space="preserve">Shareholders' equity for the relevant quarters appears only in scanned statements without a text layer, so lending headroom against the 200 per cent regulatory cap was not calculated and no ratio depending on it appears in this report.</w:t>
+        <w:t xml:space="preserve">The funding cost in Section 4.4 is an estimate. Template line 24 holds loan-loss provisions and the borrowing cost of the loan book together, and the estimate removes the change in the balance-sheet allowance; write-offs would make it overstate funding cost and understate the net gain from extra lending.</w:t>
       </w:r>
     </w:p>
     <w:p>
@@ -22013,6 +22555,21 @@
           <w:sz w:val="23"/>
           <w:szCs w:val="23"/>
         </w:rPr>
+        <w:t xml:space="preserve">DNSE's financial figures were replaced on 24 September 2026 by a line-by-line pull of its filed statements, checked against the reviewed half-year statements. The pull corrected 2025 revenue from VND 1,467 billion to VND 1,457.9 billion, first-half pre-tax profit from VND 113.1 billion to the reviewed VND 111.6 billion, and investment income, which the earlier draft had taken from trading gains for 2025 and from held-to-maturity interest for 2026. It also dropped a press figure of 405 per cent growth in proprietary provisions that no line of the filings reproduces; the line it appears to describe mostly holds the borrowing cost of the loan book.</w:t>
+      </w:r>
+    </w:p>
+    <w:p>
+      <w:pPr>
+        <w:spacing w:after="160" w:line="300"/>
+        <w:jc w:val="both"/>
+      </w:pPr>
+      <w:r>
+        <w:rPr>
+          <w:rFonts w:ascii="Times New Roman" w:cs="Times New Roman" w:eastAsia="Times New Roman" w:hAnsi="Times New Roman"/>
+          <w:color w:val="000000"/>
+          <w:sz w:val="23"/>
+          <w:szCs w:val="23"/>
+        </w:rPr>
         <w:t xml:space="preserve">The review cleaning rules were revised on 23 September 2026 after an audit of the code. The referral rule had caught genuine complaints about one-time passwords, the duplicate rule had removed identical short reviews written by different people, and several theme keywords matched unrelated words once Vietnamese tone marks were removed. Every review figure in this report uses the revised rules, and re-running the previous rules on the same pull reproduces the earlier cleaning log exactly. Segment population shares were also recovered from the Findex estimates themselves in place of typed-in values, which moved adults with secondary education or more to first place in the priority ranking.</w:t>
       </w:r>
     </w:p>
@@ -22065,7 +22622,7 @@
           <w:sz w:val="21"/>
           <w:szCs w:val="21"/>
         </w:rPr>
-        <w:t xml:space="preserve">DNSE Securities Joint Stock Company (2026) Consolidated financial statements for the second quarter of 2026 and investor relations releases for the first half of 2026. Hanoi.</w:t>
+        <w:t xml:space="preserve">DNSE Securities Joint Stock Company (2026) Financial statements for the second quarter of 2026, 20 July 2026, and interim financial statements for the six months to 30 June 2026, reviewed by KPMG, 14 August 2026. Hanoi.</w:t>
       </w:r>
     </w:p>
     <w:p>
@@ -22246,6 +22803,21 @@
           <w:szCs w:val="21"/>
         </w:rPr>
         <w:t xml:space="preserve">UOB, PwC Singapore and the Singapore FinTech Association (2025) FinTech in ASEAN 2025.</w:t>
+      </w:r>
+    </w:p>
+    <w:p>
+      <w:pPr>
+        <w:spacing w:after="130" w:line="280"/>
+        <w:ind w:left="420" w:hanging="420"/>
+      </w:pPr>
+      <w:r>
+        <w:rPr>
+          <w:rFonts w:ascii="Times New Roman" w:cs="Times New Roman" w:eastAsia="Times New Roman" w:hAnsi="Times New Roman"/>
+          <w:color w:val="000000"/>
+          <w:sz w:val="21"/>
+          <w:szCs w:val="21"/>
+        </w:rPr>
+        <w:t xml:space="preserve">Vietcap Securities (2026) IQ Insight financial statement data for DSE, first quarter of 2018 to second quarter of 2026. Retrieved 24 September 2026.</w:t>
       </w:r>
     </w:p>
     <w:p>

</xml_diff>

<commit_message>
new report with clear problems, data and solutions
</commit_message>
<xml_diff>
--- a/FBAR2_2026_DNSE_Analysis.docx
+++ b/FBAR2_2026_DNSE_Analysis.docx
@@ -213,7 +213,7 @@
           <w:sz w:val="23"/>
           <w:szCs w:val="23"/>
         </w:rPr>
-        <w:t xml:space="preserve">The income statement shows what that costs. Operating revenue rose 59.0 per cent year on year in the first half of 2026 while the pre-tax profit margin fell from 23.3 per cent across 2025 to 13.2 per cent in the half year. Direct brokerage costs have exceeded brokerage commissions in each of the last 16 quarters, and operating expenses rose 120 per cent in the first quarter of 2026. At the half-year the firm had delivered 48.9 per cent of its revenue target and 20.3 per cent of its profit target.</w:t>
+        <w:t xml:space="preserve">The income statement shows what that costs. Operating revenue rose 59.0 per cent year on year in the first half of 2026 while the pre-tax profit margin fell from 23.3 per cent across 2025 to 13.2 per cent in the half year. Direct brokerage costs have exceeded brokerage commissions in each of the last 16 quarters, and operating expenses rose 120 per cent in the first quarter of 2026. At the half-year the firm had delivered 49.1 per cent of its total revenue target and 20.3 per cent of its profit target.</w:t>
       </w:r>
     </w:p>
     <w:p>
@@ -258,7 +258,7 @@
           <w:sz w:val="23"/>
           <w:szCs w:val="23"/>
         </w:rPr>
-        <w:t xml:space="preserve">The priority problem is revenue per account. The recommendation is a cash management and fund distribution layer that converts idle balances into funded, yield-bearing accounts, priced against bank deposit rates near 7 per cent. Higher assets per account expand the collateral base for margin lending, which is already the firm's largest revenue line. The 2026 annual general meeting approved a VND 3,500 billion bond programme that funds it, although it did not approve a fund management vehicle, so a licence or a distribution partner is the first step. Round 3 should test willingness to pay, the activation sequence and the effect on lending balances.</w:t>
+        <w:t xml:space="preserve">The priority problem is revenue per account. The recommendation is a cash management and fund distribution layer that converts idle balances into funded, yield-bearing accounts, priced against bank deposit rates near 7 per cent. Higher assets per account expand the collateral base for margin lending, which is already the firm's largest revenue line. The 2026 annual general meeting approved a VND 3,500 billion bond programme that funds it and, for the second year running, the acquisition of a fund management company that the board has not yet completed; closing it, or a distribution partner in the meantime, is the first step. Round 3 should test willingness to pay, the activation sequence and the effect on lending balances.</w:t>
       </w:r>
     </w:p>
     <w:p>
@@ -750,7 +750,7 @@
           <w:sz w:val="23"/>
           <w:szCs w:val="23"/>
         </w:rPr>
-        <w:t xml:space="preserve">The market DNSE competes in is crowded and fragmenting. The ten largest firms accounted for 65.19 per cent of trading on the Ho Chi Minh exchange in the second quarter of 2026, down from 69.05 per cent three months earlier. Almost four percentage points of share moved to smaller firms in one quarter. Industry profit comes mainly from lending rather than from commissions, with VND 453,800 billion outstanding at the end of June 2026 against a regulatory cap of 200 per cent of equity. Pre-tax profit in that quarter ranged from VND 2,159 billion at VPBankS down to VND 97.4 billion at DNSE, which shows the scale difference between DNSE and the firms whose accounts it is winning.</w:t>
+        <w:t xml:space="preserve">The market DNSE competes in is crowded and fragmenting. The ten largest firms accounted for 65.19 per cent of trading on the Ho Chi Minh exchange in the second quarter of 2026, down from 69.05 per cent three months earlier. Almost four percentage points of share moved to smaller firms in one quarter. Industry profit comes mainly from lending rather than from commissions, with VND 453,800 billion outstanding at the end of June 2026 against a regulatory cap of 200 per cent of equity. Pre-tax profit in that quarter ranged from VND 2,159 billion at VPBankS to VND 75.3 billion at VIX, and DNSE's VND 97.4 billion ranked ninth of eleven, which shows the scale difference between DNSE and the firms whose accounts it is winning.</w:t>
       </w:r>
     </w:p>
     <w:p>
@@ -761,7 +761,7 @@
       <w:r>
         <w:drawing>
           <wp:inline distT="0" distB="0" distL="0" distR="0">
-            <wp:extent cx="5048250" cy="2228850"/>
+            <wp:extent cx="5048250" cy="2962275"/>
             <wp:effectExtent t="0" r="0" b="0" l="0"/>
             <wp:docPr id="1" name="" descr="" title=""/>
             <wp:cNvGraphicFramePr>
@@ -786,7 +786,7 @@
                   <pic:spPr bwMode="auto">
                     <a:xfrm>
                       <a:off x="0" y="0"/>
-                      <a:ext cx="5048250" cy="2228850"/>
+                      <a:ext cx="5048250" cy="2962275"/>
                     </a:xfrm>
                     <a:prstGeom prst="rect">
                       <a:avLst/>
@@ -813,7 +813,7 @@
           <w:sz w:val="19"/>
           <w:szCs w:val="19"/>
         </w:rPr>
-        <w:t xml:space="preserve">Figure 1. Pre-tax profit of selected Vietnamese securities firms, second quarter of 2026. DNSE ranks second in derivatives brokerage and last of these six firms by earnings.</w:t>
+        <w:t xml:space="preserve">Figure 1. Pre-tax profit of Vietnamese securities firms, second quarter of 2026, from each firm's filed statements. DNSE ranks second in derivatives brokerage and ninth of these eleven firms by earnings.</w:t>
       </w:r>
     </w:p>
     <w:p>
@@ -1119,7 +1119,7 @@
                 <w:sz w:val="18"/>
                 <w:szCs w:val="18"/>
               </w:rPr>
-              <w:t xml:space="preserve">DNSE filed statements, Q1 2018 to Q2 2026, retrieved from Vietcap's data service 24 September 2026; investor relations releases</w:t>
+              <w:t xml:space="preserve">DNSE filed statements, Q1 2018 to Q2 2026, retrieved from Vietcap's data service 24 September 2026; annual report 2025; 2026 AGM resolution and proposals</w:t>
             </w:r>
           </w:p>
         </w:tc>
@@ -1202,7 +1202,7 @@
                 <w:sz w:val="18"/>
                 <w:szCs w:val="18"/>
               </w:rPr>
-              <w:t xml:space="preserve">HOSE and HNX quarterly announcements, Q1 2024 to Q2 2026</w:t>
+              <w:t xml:space="preserve">HOSE and HNX quarterly announcements read from the exchanges' sites, 2018 to Q2 2026</w:t>
             </w:r>
           </w:p>
         </w:tc>
@@ -1258,7 +1258,7 @@
                 <w:sz w:val="18"/>
                 <w:szCs w:val="18"/>
               </w:rPr>
-              <w:t xml:space="preserve">Lending balances, pre-tax profit and revenue for the largest securities firms</w:t>
+              <w:t xml:space="preserve">Lending balances, pre-tax profit and brokerage results for the largest securities firms</w:t>
             </w:r>
           </w:p>
         </w:tc>
@@ -1285,7 +1285,7 @@
                 <w:sz w:val="18"/>
                 <w:szCs w:val="18"/>
               </w:rPr>
-              <w:t xml:space="preserve">Q2 2026 financial statements compiled by Vietstock and Mekong Asean</w:t>
+              <w:t xml:space="preserve">Filed statements of all 42 brokers with filings on Vietcap's data service, VPS included, 2018 to Q2 2026; only the industry lending total is a press compilation</w:t>
             </w:r>
           </w:p>
         </w:tc>
@@ -2858,7 +2858,7 @@
           <w:sz w:val="19"/>
           <w:szCs w:val="19"/>
         </w:rPr>
-        <w:t xml:space="preserve">Figure 2. DNSE derivatives brokerage market share, Hanoi Stock Exchange. The horizontal axis is in quarters. The second and third quarters of 2024 were not found in the sources consulted, so the line joins the first quarter of 2024 directly to the fourth.</w:t>
+        <w:t xml:space="preserve">Figure 2. DNSE derivatives brokerage market share by quarter since it entered the top ten, from the Hanoi Stock Exchange's quarterly announcements.</w:t>
       </w:r>
     </w:p>
     <w:p>
@@ -2968,7 +2968,7 @@
           <w:sz w:val="23"/>
           <w:szCs w:val="23"/>
         </w:rPr>
-        <w:t xml:space="preserve">Dividing trading share by account share gives the relative intensity of an average account. DNSE holds 12.27 per cent of the 13.85 million securities accounts in the market and produces 2.88 per cent of Hanoi listed share trading. An average DNSE account therefore trades at about 23 per cent of the value of an average market account. Both sides of that ratio count accounts rather than people, and one investor may hold accounts at several firms. The Ho Chi Minh exchange gives only an upper bound, because DNSE is outside its top ten: below 24 per cent. Lending shows the same pattern more sharply, at 1.39 per cent of industry balances against 12.27 per cent of accounts.</w:t>
+        <w:t xml:space="preserve">Dividing trading share by account share gives the relative intensity of an average account. DNSE holds 12.24 per cent of the 13.89 million securities accounts in the market and produces 2.88 per cent of Hanoi listed share trading. An average DNSE account therefore trades at about 23.5 per cent of the value of an average market account. Both sides of that ratio count accounts rather than people, and one investor may hold accounts at several firms. The Ho Chi Minh exchange gives only an upper bound, because DNSE is outside its top ten: 24.0 per cent at most. Lending shows the same pattern more sharply, at 1.39 per cent of industry balances against 12.24 per cent of accounts. The company's own figures confirm the reading: of 1,512,920 accounts at the end of 2025, 85,739 customers used any product in December and 27,100 held net assets of VND 10 million or more, 5.7 and 1.8 per cent.</w:t>
       </w:r>
     </w:p>
     <w:p>
@@ -3422,7 +3422,7 @@
           <w:sz w:val="23"/>
           <w:szCs w:val="23"/>
         </w:rPr>
-        <w:t xml:space="preserve">Against plan the position is clear. DNSE targets VND 1,736 billion of revenue and VND 550 billion of pre-tax profit for 2026. The half-year delivered 48.9 per cent of the revenue target and 20.3 per cent of the profit target, so the second half must produce VND 438.4 billion of pre-tax profit, which is 3.9 times the first half.</w:t>
+        <w:t xml:space="preserve">Against plan the position is clear. DNSE targets VND 1,736 billion of total revenue, which includes financial income, and VND 550 billion of pre-tax profit for 2026. The half-year delivered 49.1 per cent of the revenue target and 20.3 per cent of the profit target, so the second half must produce VND 438.4 billion of pre-tax profit, which is 3.9 times the first half.</w:t>
       </w:r>
     </w:p>
     <w:p>
@@ -3549,7 +3549,7 @@
           <w:sz w:val="23"/>
           <w:szCs w:val="23"/>
         </w:rPr>
-        <w:t xml:space="preserve">Derivatives compounds the effect. A derivatives account needs a margin deposit and turns over quickly, so it produces visible market share from a small pool of capital. In the second quarter of 2026 the VN30 futures market averaged VND 43,925 billion of daily notional value, against VND 17,336 billion of daily value on the Ho Chi Minh cash market in August. Futures notional is not directly comparable with cash turnover, because a contract controls a notional amount many times the margin posted against it, and that is the point. High share in derivatives is compatible with a small asset base, which is exactly what DNSE reports.</w:t>
+        <w:t xml:space="preserve">Derivatives compounds the effect. A derivatives account needs a margin deposit and turns over quickly, so it produces visible market share from a small pool of capital. In the second quarter of 2026 the front-month VN30 futures contract alone averaged VND 40,855 billion of daily notional value, against VND 22,163 billion of daily value on the Ho Chi Minh cash market. Futures notional is not directly comparable with cash turnover, because a contract controls a notional amount many times the margin posted against it, and that is the point. High share in derivatives is compatible with a small asset base, which is exactly what DNSE reports.</w:t>
       </w:r>
     </w:p>
     <w:p>
@@ -5262,7 +5262,7 @@
           <w:sz w:val="23"/>
           <w:szCs w:val="23"/>
         </w:rPr>
-        <w:t xml:space="preserve">The scale of the prize can be stated from the filed statements. Interest income of VND 336.1 billion in the first half of 2026 on an average lending balance of about VND 6,015 billion, the mean of the balances at the end of 2025 and of each quarter, implies a yield near 11 per cent a year, against an estimated funding cost of 6.3 per cent. Raising the lending book by VND 1,000 billion, an increase of 16 per cent, would add roughly VND 112 billion of annual interest income, or about VND 49 billion after funding costs, which is 9 per cent of the 2026 pre-tax profit target. Closing the full distance between DNSE's 1.39 per cent lending share and its 12.27 per cent account share would imply a book near VND 55,000 billion, which exceeds the firm's capital and is not a realistic target. The point is that even a small movement toward the account share is material.</w:t>
+        <w:t xml:space="preserve">The scale of the prize can be stated from the filed statements. Interest income of VND 336.1 billion in the first half of 2026 on an average lending balance of about VND 6,015 billion, the mean of the balances at the end of 2025 and of each quarter, implies a yield near 11 per cent a year, against an estimated funding cost of 6.3 per cent. Raising the lending book by VND 1,000 billion, an increase of 16 per cent, would add roughly VND 112 billion of annual interest income, or about VND 49 billion after funding costs, which is 9 per cent of the 2026 pre-tax profit target. Closing the full distance between DNSE's 1.39 per cent lending share and its 12.24 per cent account share would imply a book near VND 56,000 billion, which exceeds the firm's capital and is not a realistic target. The point is that even a small movement toward the account share is material.</w:t>
       </w:r>
     </w:p>
     <w:p>
@@ -6273,7 +6273,7 @@
                 <w:sz w:val="17"/>
                 <w:szCs w:val="17"/>
               </w:rPr>
-              <w:t xml:space="preserve">Needs a funding rate credible against deposits paying 6 to 9 per cent, a fund management licence or a distribution partner, and scale before the margin works</w:t>
+              <w:t xml:space="preserve">Needs a funding rate credible against deposits paying 6 to 9 per cent, completion of the approved fund management acquisition or a distribution partner, and scale before the margin works</w:t>
             </w:r>
           </w:p>
         </w:tc>
@@ -6590,7 +6590,7 @@
           <w:sz w:val="23"/>
           <w:szCs w:val="23"/>
         </w:rPr>
-        <w:t xml:space="preserve">Two conditions make this feasible now. The 2026 annual general meeting approved a bond programme of VND 2,500 billion non-convertible and VND 1,000 billion convertible, which provides the funding a cash management product needs. Customers already recognise the feature, since the idle cash earning function is the capability they praise most often without being asked about it. One condition is missing. The same meeting approved a securities company at the Ho Chi Minh City International Financial Centre, a VND 10 billion stake in a digital asset company and participation in the carbon credit exchange, and it did not approve a fund management vehicle. Distributing investment certificates therefore requires either a licence application or a partnership with an existing fund manager, and that is the first decision Round 3 should resolve.</w:t>
+        <w:t xml:space="preserve">Two conditions make this feasible now. The 2026 annual general meeting approved a bond programme of VND 2,500 billion non-convertible and VND 1,000 billion convertible, which provides the funding a cash management product needs. Customers already recognise the feature, since the idle cash earning function is the capability they praise most often without being asked about it. The same meeting approved, for the second year running, owning one fund management company as a subsidiary to manage and distribute investment fund certificates, alongside a securities company at the Ho Chi Minh City International Financial Centre. The board has not yet completed that acquisition, and the 2026 plan already names Vietcombank, VietinBank and BIDV as intended partners for bonds and fund certificates on the Trung Vang (Golden Egg) product. Closing the acquisition, or distributing through a partner fund manager until it closes, is the first decision Round 3 should resolve.</w:t>
       </w:r>
     </w:p>
     <w:p>
@@ -6656,7 +6656,7 @@
           <w:sz w:val="23"/>
           <w:szCs w:val="23"/>
         </w:rPr>
-        <w:t xml:space="preserve">Measure the distribution of account balances at DNSE. This report infers low balances per account from the ratio of trading share to account share. The company holds the distribution directly, and it would confirm whether inactivity concentrates in a small tail or runs across the base.</w:t>
+        <w:t xml:space="preserve">Measure the full distribution of account balances at DNSE. The annual report gives two thresholds, 5.7 per cent active and 1.8 per cent above VND 10 million; the company holds the distribution below them, which would show where funded balances begin and how they move after onboarding.</w:t>
       </w:r>
     </w:p>
     <w:p>
@@ -8519,7 +8519,7 @@
                 <w:sz w:val="18"/>
                 <w:szCs w:val="18"/>
               </w:rPr>
-              <w:t xml:space="preserve">1.50</w:t>
+              <w:t xml:space="preserve">1.51</w:t>
             </w:r>
           </w:p>
         </w:tc>
@@ -9083,7 +9083,7 @@
                 <w:sz w:val="17"/>
                 <w:szCs w:val="17"/>
               </w:rPr>
-              <w:t xml:space="preserve">31,300</w:t>
+              <w:t xml:space="preserve">31,311</w:t>
             </w:r>
           </w:p>
         </w:tc>
@@ -9166,7 +9166,7 @@
                 <w:sz w:val="17"/>
                 <w:szCs w:val="17"/>
               </w:rPr>
-              <w:t xml:space="preserve">not published</w:t>
+              <w:t xml:space="preserve">6.58</w:t>
             </w:r>
           </w:p>
         </w:tc>
@@ -9220,7 +9220,7 @@
                 <w:sz w:val="17"/>
                 <w:szCs w:val="17"/>
               </w:rPr>
-              <w:t xml:space="preserve">40,500</w:t>
+              <w:t xml:space="preserve">40,473</w:t>
             </w:r>
           </w:p>
         </w:tc>
@@ -9330,7 +9330,7 @@
                 <w:sz w:val="17"/>
                 <w:szCs w:val="17"/>
               </w:rPr>
-              <w:t xml:space="preserve"/>
+              <w:t xml:space="preserve">4.83</w:t>
             </w:r>
           </w:p>
         </w:tc>
@@ -9357,7 +9357,7 @@
                 <w:sz w:val="17"/>
                 <w:szCs w:val="17"/>
               </w:rPr>
-              <w:t xml:space="preserve">51,500</w:t>
+              <w:t xml:space="preserve">51,522</w:t>
             </w:r>
           </w:p>
         </w:tc>
@@ -9494,7 +9494,7 @@
                 <w:sz w:val="17"/>
                 <w:szCs w:val="17"/>
               </w:rPr>
-              <w:t xml:space="preserve"/>
+              <w:t xml:space="preserve">17,146</w:t>
             </w:r>
           </w:p>
         </w:tc>
@@ -9577,7 +9577,7 @@
                 <w:sz w:val="17"/>
                 <w:szCs w:val="17"/>
               </w:rPr>
-              <w:t xml:space="preserve">outside top ten</w:t>
+              <w:t xml:space="preserve"/>
             </w:r>
           </w:p>
         </w:tc>
@@ -9604,7 +9604,7 @@
                 <w:sz w:val="17"/>
                 <w:szCs w:val="17"/>
               </w:rPr>
-              <w:t xml:space="preserve"/>
+              <w:t xml:space="preserve">9.23</w:t>
             </w:r>
           </w:p>
         </w:tc>
@@ -9631,7 +9631,7 @@
                 <w:sz w:val="17"/>
                 <w:szCs w:val="17"/>
               </w:rPr>
-              <w:t xml:space="preserve">29,000</w:t>
+              <w:t xml:space="preserve">29,024</w:t>
             </w:r>
           </w:p>
         </w:tc>
@@ -9714,7 +9714,7 @@
                 <w:sz w:val="17"/>
                 <w:szCs w:val="17"/>
               </w:rPr>
-              <w:t xml:space="preserve">not published</w:t>
+              <w:t xml:space="preserve">5.34</w:t>
             </w:r>
           </w:p>
         </w:tc>
@@ -9741,7 +9741,7 @@
                 <w:sz w:val="17"/>
                 <w:szCs w:val="17"/>
               </w:rPr>
-              <w:t xml:space="preserve">about 4</w:t>
+              <w:t xml:space="preserve">4.00</w:t>
             </w:r>
           </w:p>
         </w:tc>
@@ -9768,7 +9768,7 @@
                 <w:sz w:val="17"/>
                 <w:szCs w:val="17"/>
               </w:rPr>
-              <w:t xml:space="preserve"/>
+              <w:t xml:space="preserve">16,828</w:t>
             </w:r>
           </w:p>
         </w:tc>
@@ -9851,7 +9851,7 @@
                 <w:sz w:val="17"/>
                 <w:szCs w:val="17"/>
               </w:rPr>
-              <w:t xml:space="preserve">not published</w:t>
+              <w:t xml:space="preserve">5.88</w:t>
             </w:r>
           </w:p>
         </w:tc>
@@ -9878,7 +9878,7 @@
                 <w:sz w:val="17"/>
                 <w:szCs w:val="17"/>
               </w:rPr>
-              <w:t xml:space="preserve">about 4</w:t>
+              <w:t xml:space="preserve">4.01</w:t>
             </w:r>
           </w:p>
         </w:tc>
@@ -9905,7 +9905,7 @@
                 <w:sz w:val="17"/>
                 <w:szCs w:val="17"/>
               </w:rPr>
-              <w:t xml:space="preserve"/>
+              <w:t xml:space="preserve">12,859</w:t>
             </w:r>
           </w:p>
         </w:tc>
@@ -10042,7 +10042,7 @@
                 <w:sz w:val="17"/>
                 <w:szCs w:val="17"/>
               </w:rPr>
-              <w:t xml:space="preserve">38,200</w:t>
+              <w:t xml:space="preserve">38,177</w:t>
             </w:r>
           </w:p>
         </w:tc>
@@ -10125,7 +10125,7 @@
                 <w:sz w:val="17"/>
                 <w:szCs w:val="17"/>
               </w:rPr>
-              <w:t xml:space="preserve">outside top ten</w:t>
+              <w:t xml:space="preserve"/>
             </w:r>
           </w:p>
         </w:tc>
@@ -10262,7 +10262,7 @@
                 <w:sz w:val="17"/>
                 <w:szCs w:val="17"/>
               </w:rPr>
-              <w:t xml:space="preserve">outside top ten</w:t>
+              <w:t xml:space="preserve"/>
             </w:r>
           </w:p>
         </w:tc>
@@ -10289,7 +10289,7 @@
                 <w:sz w:val="17"/>
                 <w:szCs w:val="17"/>
               </w:rPr>
-              <w:t xml:space="preserve">below 2</w:t>
+              <w:t xml:space="preserve">1.82</w:t>
             </w:r>
           </w:p>
         </w:tc>
@@ -10372,7 +10372,7 @@
                 <w:sz w:val="17"/>
                 <w:szCs w:val="17"/>
               </w:rPr>
-              <w:t xml:space="preserve">outside top ten</w:t>
+              <w:t xml:space="preserve"/>
             </w:r>
           </w:p>
         </w:tc>
@@ -10453,7 +10453,7 @@
                 <w:sz w:val="17"/>
                 <w:szCs w:val="17"/>
               </w:rPr>
-              <w:t xml:space="preserve"/>
+              <w:t xml:space="preserve">9,471</w:t>
             </w:r>
           </w:p>
         </w:tc>
@@ -10509,7 +10509,7 @@
                 <w:sz w:val="17"/>
                 <w:szCs w:val="17"/>
               </w:rPr>
-              <w:t xml:space="preserve">outside top ten</w:t>
+              <w:t xml:space="preserve"/>
             </w:r>
           </w:p>
         </w:tc>
@@ -10646,7 +10646,7 @@
                 <w:sz w:val="17"/>
                 <w:szCs w:val="17"/>
               </w:rPr>
-              <w:t xml:space="preserve">outside top ten</w:t>
+              <w:t xml:space="preserve"/>
             </w:r>
           </w:p>
         </w:tc>
@@ -10727,7 +10727,281 @@
                 <w:sz w:val="17"/>
                 <w:szCs w:val="17"/>
               </w:rPr>
+              <w:t xml:space="preserve">13,958</w:t>
+            </w:r>
+          </w:p>
+        </w:tc>
+      </w:tr>
+      <w:tr>
+        <w:tc>
+          <w:tcPr>
+            <w:tcW w:type="dxa" w:w="2600"/>
+            <w:tcMar>
+              <w:top w:type="dxa" w:w="70"/>
+              <w:left w:type="dxa" w:w="100"/>
+              <w:bottom w:type="dxa" w:w="70"/>
+              <w:right w:type="dxa" w:w="100"/>
+            </w:tcMar>
+            <w:vAlign w:val="center"/>
+          </w:tcPr>
+          <w:p>
+            <w:pPr>
+              <w:spacing w:after="0" w:line="260"/>
+              <w:jc w:val="left"/>
+            </w:pPr>
+            <w:r>
+              <w:rPr>
+                <w:rFonts w:ascii="Times New Roman" w:cs="Times New Roman" w:eastAsia="Times New Roman" w:hAnsi="Times New Roman"/>
+                <w:color w:val="000000"/>
+                <w:sz w:val="17"/>
+                <w:szCs w:val="17"/>
+              </w:rPr>
+              <w:t xml:space="preserve">FPTS</w:t>
+            </w:r>
+          </w:p>
+        </w:tc>
+        <w:tc>
+          <w:tcPr>
+            <w:tcW w:type="dxa" w:w="1900"/>
+            <w:tcMar>
+              <w:top w:type="dxa" w:w="70"/>
+              <w:left w:type="dxa" w:w="100"/>
+              <w:bottom w:type="dxa" w:w="70"/>
+              <w:right w:type="dxa" w:w="100"/>
+            </w:tcMar>
+            <w:vAlign w:val="center"/>
+          </w:tcPr>
+          <w:p>
+            <w:pPr>
+              <w:spacing w:after="0" w:line="260"/>
+              <w:jc w:val="right"/>
+            </w:pPr>
+            <w:r>
+              <w:rPr>
+                <w:rFonts w:ascii="Times New Roman" w:cs="Times New Roman" w:eastAsia="Times New Roman" w:hAnsi="Times New Roman"/>
+                <w:color w:val="000000"/>
+                <w:sz w:val="17"/>
+                <w:szCs w:val="17"/>
+              </w:rPr>
               <w:t xml:space="preserve"/>
+            </w:r>
+          </w:p>
+        </w:tc>
+        <w:tc>
+          <w:tcPr>
+            <w:tcW w:type="dxa" w:w="1900"/>
+            <w:tcMar>
+              <w:top w:type="dxa" w:w="70"/>
+              <w:left w:type="dxa" w:w="100"/>
+              <w:bottom w:type="dxa" w:w="70"/>
+              <w:right w:type="dxa" w:w="100"/>
+            </w:tcMar>
+            <w:vAlign w:val="center"/>
+          </w:tcPr>
+          <w:p>
+            <w:pPr>
+              <w:spacing w:after="0" w:line="260"/>
+              <w:jc w:val="right"/>
+            </w:pPr>
+            <w:r>
+              <w:rPr>
+                <w:rFonts w:ascii="Times New Roman" w:cs="Times New Roman" w:eastAsia="Times New Roman" w:hAnsi="Times New Roman"/>
+                <w:color w:val="000000"/>
+                <w:sz w:val="17"/>
+                <w:szCs w:val="17"/>
+              </w:rPr>
+              <w:t xml:space="preserve"/>
+            </w:r>
+          </w:p>
+        </w:tc>
+        <w:tc>
+          <w:tcPr>
+            <w:tcW w:type="dxa" w:w="1900"/>
+            <w:tcMar>
+              <w:top w:type="dxa" w:w="70"/>
+              <w:left w:type="dxa" w:w="100"/>
+              <w:bottom w:type="dxa" w:w="70"/>
+              <w:right w:type="dxa" w:w="100"/>
+            </w:tcMar>
+            <w:vAlign w:val="center"/>
+          </w:tcPr>
+          <w:p>
+            <w:pPr>
+              <w:spacing w:after="0" w:line="260"/>
+              <w:jc w:val="right"/>
+            </w:pPr>
+            <w:r>
+              <w:rPr>
+                <w:rFonts w:ascii="Times New Roman" w:cs="Times New Roman" w:eastAsia="Times New Roman" w:hAnsi="Times New Roman"/>
+                <w:color w:val="000000"/>
+                <w:sz w:val="17"/>
+                <w:szCs w:val="17"/>
+              </w:rPr>
+              <w:t xml:space="preserve">1.91</w:t>
+            </w:r>
+          </w:p>
+        </w:tc>
+        <w:tc>
+          <w:tcPr>
+            <w:tcW w:type="dxa" w:w="1120"/>
+            <w:tcMar>
+              <w:top w:type="dxa" w:w="70"/>
+              <w:left w:type="dxa" w:w="100"/>
+              <w:bottom w:type="dxa" w:w="70"/>
+              <w:right w:type="dxa" w:w="100"/>
+            </w:tcMar>
+            <w:vAlign w:val="center"/>
+          </w:tcPr>
+          <w:p>
+            <w:pPr>
+              <w:spacing w:after="0" w:line="260"/>
+              <w:jc w:val="right"/>
+            </w:pPr>
+            <w:r>
+              <w:rPr>
+                <w:rFonts w:ascii="Times New Roman" w:cs="Times New Roman" w:eastAsia="Times New Roman" w:hAnsi="Times New Roman"/>
+                <w:color w:val="000000"/>
+                <w:sz w:val="17"/>
+                <w:szCs w:val="17"/>
+              </w:rPr>
+              <w:t xml:space="preserve">6,380</w:t>
+            </w:r>
+          </w:p>
+        </w:tc>
+      </w:tr>
+      <w:tr>
+        <w:tc>
+          <w:tcPr>
+            <w:tcW w:type="dxa" w:w="2600"/>
+            <w:tcMar>
+              <w:top w:type="dxa" w:w="70"/>
+              <w:left w:type="dxa" w:w="100"/>
+              <w:bottom w:type="dxa" w:w="70"/>
+              <w:right w:type="dxa" w:w="100"/>
+            </w:tcMar>
+            <w:vAlign w:val="center"/>
+          </w:tcPr>
+          <w:p>
+            <w:pPr>
+              <w:spacing w:after="0" w:line="260"/>
+              <w:jc w:val="left"/>
+            </w:pPr>
+            <w:r>
+              <w:rPr>
+                <w:rFonts w:ascii="Times New Roman" w:cs="Times New Roman" w:eastAsia="Times New Roman" w:hAnsi="Times New Roman"/>
+                <w:color w:val="000000"/>
+                <w:sz w:val="17"/>
+                <w:szCs w:val="17"/>
+              </w:rPr>
+              <w:t xml:space="preserve">PHS</w:t>
+            </w:r>
+          </w:p>
+        </w:tc>
+        <w:tc>
+          <w:tcPr>
+            <w:tcW w:type="dxa" w:w="1900"/>
+            <w:tcMar>
+              <w:top w:type="dxa" w:w="70"/>
+              <w:left w:type="dxa" w:w="100"/>
+              <w:bottom w:type="dxa" w:w="70"/>
+              <w:right w:type="dxa" w:w="100"/>
+            </w:tcMar>
+            <w:vAlign w:val="center"/>
+          </w:tcPr>
+          <w:p>
+            <w:pPr>
+              <w:spacing w:after="0" w:line="260"/>
+              <w:jc w:val="right"/>
+            </w:pPr>
+            <w:r>
+              <w:rPr>
+                <w:rFonts w:ascii="Times New Roman" w:cs="Times New Roman" w:eastAsia="Times New Roman" w:hAnsi="Times New Roman"/>
+                <w:color w:val="000000"/>
+                <w:sz w:val="17"/>
+                <w:szCs w:val="17"/>
+              </w:rPr>
+              <w:t xml:space="preserve"/>
+            </w:r>
+          </w:p>
+        </w:tc>
+        <w:tc>
+          <w:tcPr>
+            <w:tcW w:type="dxa" w:w="1900"/>
+            <w:tcMar>
+              <w:top w:type="dxa" w:w="70"/>
+              <w:left w:type="dxa" w:w="100"/>
+              <w:bottom w:type="dxa" w:w="70"/>
+              <w:right w:type="dxa" w:w="100"/>
+            </w:tcMar>
+            <w:vAlign w:val="center"/>
+          </w:tcPr>
+          <w:p>
+            <w:pPr>
+              <w:spacing w:after="0" w:line="260"/>
+              <w:jc w:val="right"/>
+            </w:pPr>
+            <w:r>
+              <w:rPr>
+                <w:rFonts w:ascii="Times New Roman" w:cs="Times New Roman" w:eastAsia="Times New Roman" w:hAnsi="Times New Roman"/>
+                <w:color w:val="000000"/>
+                <w:sz w:val="17"/>
+                <w:szCs w:val="17"/>
+              </w:rPr>
+              <w:t xml:space="preserve"/>
+            </w:r>
+          </w:p>
+        </w:tc>
+        <w:tc>
+          <w:tcPr>
+            <w:tcW w:type="dxa" w:w="1900"/>
+            <w:tcMar>
+              <w:top w:type="dxa" w:w="70"/>
+              <w:left w:type="dxa" w:w="100"/>
+              <w:bottom w:type="dxa" w:w="70"/>
+              <w:right w:type="dxa" w:w="100"/>
+            </w:tcMar>
+            <w:vAlign w:val="center"/>
+          </w:tcPr>
+          <w:p>
+            <w:pPr>
+              <w:spacing w:after="0" w:line="260"/>
+              <w:jc w:val="right"/>
+            </w:pPr>
+            <w:r>
+              <w:rPr>
+                <w:rFonts w:ascii="Times New Roman" w:cs="Times New Roman" w:eastAsia="Times New Roman" w:hAnsi="Times New Roman"/>
+                <w:color w:val="000000"/>
+                <w:sz w:val="17"/>
+                <w:szCs w:val="17"/>
+              </w:rPr>
+              <w:t xml:space="preserve">1.29</w:t>
+            </w:r>
+          </w:p>
+        </w:tc>
+        <w:tc>
+          <w:tcPr>
+            <w:tcW w:type="dxa" w:w="1120"/>
+            <w:tcMar>
+              <w:top w:type="dxa" w:w="70"/>
+              <w:left w:type="dxa" w:w="100"/>
+              <w:bottom w:type="dxa" w:w="70"/>
+              <w:right w:type="dxa" w:w="100"/>
+            </w:tcMar>
+            <w:vAlign w:val="center"/>
+          </w:tcPr>
+          <w:p>
+            <w:pPr>
+              <w:spacing w:after="0" w:line="260"/>
+              <w:jc w:val="right"/>
+            </w:pPr>
+            <w:r>
+              <w:rPr>
+                <w:rFonts w:ascii="Times New Roman" w:cs="Times New Roman" w:eastAsia="Times New Roman" w:hAnsi="Times New Roman"/>
+                <w:color w:val="000000"/>
+                <w:sz w:val="17"/>
+                <w:szCs w:val="17"/>
+              </w:rPr>
+              <w:t xml:space="preserve">3,995</w:t>
             </w:r>
           </w:p>
         </w:tc>
@@ -10884,7 +11158,7 @@
           <w:sz w:val="19"/>
           <w:szCs w:val="19"/>
         </w:rPr>
-        <w:t xml:space="preserve">Table A2. Percentages are share of traded value on the named market. Empty cells were not published in the sources consulted. Sources are the HOSE and HNX quarterly announcements of 7 July 2026 and the Q2 2026 financial statements compiled by Vietstock.</w:t>
+        <w:t xml:space="preserve">Table A2. Percentages are share of traded value on the named market; an empty cell means the firm was outside that market's top ten. Market shares are from the HOSE and HNX quarterly announcements of July 2026. Lending balances are from each firm's filed statements at 30 June 2026; the industry total is a Vietstock compilation.</w:t>
       </w:r>
     </w:p>
     <w:p>
@@ -18055,6 +18329,118 @@
                 <w:szCs w:val="18"/>
               </w:rPr>
               <w:t xml:space="preserve">https://ir.dnse.com.vn/vi/ctype-finance_report</w:t>
+            </w:r>
+          </w:p>
+        </w:tc>
+      </w:tr>
+      <w:tr>
+        <w:tc>
+          <w:tcPr>
+            <w:tcW w:type="dxa" w:w="2700"/>
+            <w:tcMar>
+              <w:top w:type="dxa" w:w="70"/>
+              <w:left w:type="dxa" w:w="100"/>
+              <w:bottom w:type="dxa" w:w="70"/>
+              <w:right w:type="dxa" w:w="100"/>
+            </w:tcMar>
+            <w:vAlign w:val="center"/>
+          </w:tcPr>
+          <w:p>
+            <w:pPr>
+              <w:spacing w:after="0" w:line="260"/>
+              <w:jc w:val="left"/>
+            </w:pPr>
+            <w:r>
+              <w:rPr>
+                <w:rFonts w:ascii="Times New Roman" w:cs="Times New Roman" w:eastAsia="Times New Roman" w:hAnsi="Times New Roman"/>
+                <w:color w:val="000000"/>
+                <w:sz w:val="18"/>
+                <w:szCs w:val="18"/>
+              </w:rPr>
+              <w:t xml:space="preserve">DNSE annual report 2025</w:t>
+            </w:r>
+          </w:p>
+        </w:tc>
+        <w:tc>
+          <w:tcPr>
+            <w:tcW w:type="dxa" w:w="6320"/>
+            <w:tcMar>
+              <w:top w:type="dxa" w:w="70"/>
+              <w:left w:type="dxa" w:w="100"/>
+              <w:bottom w:type="dxa" w:w="70"/>
+              <w:right w:type="dxa" w:w="100"/>
+            </w:tcMar>
+            <w:vAlign w:val="center"/>
+          </w:tcPr>
+          <w:p>
+            <w:pPr>
+              <w:spacing w:after="0" w:line="260"/>
+              <w:jc w:val="left"/>
+            </w:pPr>
+            <w:r>
+              <w:rPr>
+                <w:rFonts w:ascii="Times New Roman" w:cs="Times New Roman" w:eastAsia="Times New Roman" w:hAnsi="Times New Roman"/>
+                <w:color w:val="000000"/>
+                <w:sz w:val="18"/>
+                <w:szCs w:val="18"/>
+              </w:rPr>
+              <w:t xml:space="preserve">https://ir.dnse.com.vn/vi/ctype-yearly_report</w:t>
+            </w:r>
+          </w:p>
+        </w:tc>
+      </w:tr>
+      <w:tr>
+        <w:tc>
+          <w:tcPr>
+            <w:tcW w:type="dxa" w:w="2700"/>
+            <w:tcMar>
+              <w:top w:type="dxa" w:w="70"/>
+              <w:left w:type="dxa" w:w="100"/>
+              <w:bottom w:type="dxa" w:w="70"/>
+              <w:right w:type="dxa" w:w="100"/>
+            </w:tcMar>
+            <w:vAlign w:val="center"/>
+          </w:tcPr>
+          <w:p>
+            <w:pPr>
+              <w:spacing w:after="0" w:line="260"/>
+              <w:jc w:val="left"/>
+            </w:pPr>
+            <w:r>
+              <w:rPr>
+                <w:rFonts w:ascii="Times New Roman" w:cs="Times New Roman" w:eastAsia="Times New Roman" w:hAnsi="Times New Roman"/>
+                <w:color w:val="000000"/>
+                <w:sz w:val="18"/>
+                <w:szCs w:val="18"/>
+              </w:rPr>
+              <w:t xml:space="preserve">DNSE 2026 AGM resolution and proposals</w:t>
+            </w:r>
+          </w:p>
+        </w:tc>
+        <w:tc>
+          <w:tcPr>
+            <w:tcW w:type="dxa" w:w="6320"/>
+            <w:tcMar>
+              <w:top w:type="dxa" w:w="70"/>
+              <w:left w:type="dxa" w:w="100"/>
+              <w:bottom w:type="dxa" w:w="70"/>
+              <w:right w:type="dxa" w:w="100"/>
+            </w:tcMar>
+            <w:vAlign w:val="center"/>
+          </w:tcPr>
+          <w:p>
+            <w:pPr>
+              <w:spacing w:after="0" w:line="260"/>
+              <w:jc w:val="left"/>
+            </w:pPr>
+            <w:r>
+              <w:rPr>
+                <w:rFonts w:ascii="Times New Roman" w:cs="Times New Roman" w:eastAsia="Times New Roman" w:hAnsi="Times New Roman"/>
+                <w:color w:val="000000"/>
+                <w:sz w:val="18"/>
+                <w:szCs w:val="18"/>
+              </w:rPr>
+              <w:t xml:space="preserve">https://ir.dnse.com.vn/vi/ntag-dai-hoi-dong-co-dong-19</w:t>
             </w:r>
           </w:p>
         </w:tc>
@@ -22285,7 +22671,7 @@
           <w:sz w:val="23"/>
           <w:szCs w:val="23"/>
         </w:rPr>
-        <w:t xml:space="preserve">All currency figures are Vietnamese dong unless stated. Market share on HOSE, HNX and the derivatives market is defined by each exchange as a share of traded value on that market alone, so a figure from one exchange is never compared with a figure from another. Lending balances are margin loans plus advances against sale proceeds, which is the basis on which Vietstock compiles the industry total of VND 453,800 billion. Press estimates of margin lending alone for the same date cluster near VND 445,000 billion, and DNSE's share is 1.39 per cent on the first basis and 1.42 per cent on the second.</w:t>
+        <w:t xml:space="preserve">All currency figures are Vietnamese dong unless stated. Market share on HOSE, HNX and the derivatives market is defined by each exchange as a share of traded value on that market alone, so a figure from one exchange is never compared with a figure from another. Lending balances are margin loans plus advances against sale proceeds, which is the basis on which Vietstock compiles the industry total of VND 453,800 billion. Press estimates of margin lending alone for the same date cluster near VND 445,000 billion, and DNSE's share is 1.39 per cent on the first basis and 1.42 per cent on the second. The 42 brokers with filings account for VND 345,309 billion of it, 76 per cent; the rest sits with brokers that do not file on the service.</w:t>
       </w:r>
     </w:p>
     <w:p>
@@ -22300,7 +22686,7 @@
           <w:sz w:val="23"/>
           <w:szCs w:val="23"/>
         </w:rPr>
-        <w:t xml:space="preserve">Account share uses 13.80 million domestic individual accounts plus 52,633 foreign accounts at the end of August 2026 as the denominator. One investor may hold accounts at several firms, so the denominator counts accounts rather than people.</w:t>
+        <w:t xml:space="preserve">Account share divides DNSE's 1.7 million accounts at 30 June 2026 by the 13,887,603 investor trading accounts on the VSDC counter on 24 September 2026. The later market date understates DNSE's share slightly. One investor may hold accounts at several firms, so both counts are accounts rather than people.</w:t>
       </w:r>
     </w:p>
     <w:p>
@@ -22412,7 +22798,7 @@
           <w:sz w:val="23"/>
           <w:szCs w:val="23"/>
         </w:rPr>
-        <w:t xml:space="preserve">Derivatives share for the second and third quarters of 2024 was not found in the sources consulted, and Figure 2 shows that gap on a quarterly axis rather than interpolating across it.</w:t>
+        <w:t xml:space="preserve">Market share is read from the exchanges' own announcements: 139 HNX notices from 2018 and every HOSE notice its news service holds. Quarters before DNSE entered a top ten carry only the tenth-place share, which bounds DNSE's share from above.</w:t>
       </w:r>
     </w:p>
     <w:p>
@@ -22555,7 +22941,22 @@
           <w:sz w:val="23"/>
           <w:szCs w:val="23"/>
         </w:rPr>
-        <w:t xml:space="preserve">DNSE's financial figures were replaced on 24 September 2026 by a line-by-line pull of its filed statements, checked against the reviewed half-year statements. The pull corrected 2025 revenue from VND 1,467 billion to VND 1,457.9 billion, first-half pre-tax profit from VND 113.1 billion to the reviewed VND 111.6 billion, and investment income, which the earlier draft had taken from trading gains for 2025 and from held-to-maturity interest for 2026. It also dropped a press figure of 405 per cent growth in proprietary provisions that no line of the filings reproduces; the line it appears to describe mostly holds the borrowing cost of the loan book.</w:t>
+        <w:t xml:space="preserve">DNSE's financial figures were replaced on 24 September 2026 by a line-by-line pull of its filed statements, checked against the reviewed half-year statements. The pull separated operating revenue, VND 1,457.9 billion for 2025, from the VND 1,467 billion total revenue in the annual report, which adds financial and other income; the 2026 plan is set on total revenue and is compared on that basis. It replaced first-half pre-tax profit of VND 113.1 billion with the reviewed VND 111.6 billion, and corrected investment income, which the earlier draft had taken from trading gains for 2025 and from held-to-maturity interest for 2026. It also dropped a press figure of 405 per cent growth in proprietary provisions that no line of the filings reproduces; the line it appears to describe mostly holds the borrowing cost of the loan book. Peer lending and profit were replaced by each listed firm's own filings, which moved SSI's second-quarter pre-tax profit from the press figure of VND 1,511 billion to VND 1,529 billion.</w:t>
+      </w:r>
+    </w:p>
+    <w:p>
+      <w:pPr>
+        <w:spacing w:after="160" w:line="300"/>
+        <w:jc w:val="both"/>
+      </w:pPr>
+      <w:r>
+        <w:rPr>
+          <w:rFonts w:ascii="Times New Roman" w:cs="Times New Roman" w:eastAsia="Times New Roman" w:hAnsi="Times New Roman"/>
+          <w:color w:val="000000"/>
+          <w:sz w:val="23"/>
+          <w:szCs w:val="23"/>
+        </w:rPr>
+        <w:t xml:space="preserve">Company facts were checked against the 2025 annual report and the resolution and proposals of the 2026 annual general meeting. The annual report gave the account count, active customers and customer assets used here, which replace rounded press figures. The resolution showed that the meeting approved the acquisition of a fund management company, which an earlier draft reported as not approved, and it contains no approval of a digital asset stake or of carbon credit participation, which press coverage had attributed to the meeting; both were removed.</w:t>
       </w:r>
     </w:p>
     <w:p>
@@ -22637,7 +23038,7 @@
           <w:sz w:val="21"/>
           <w:szCs w:val="21"/>
         </w:rPr>
-        <w:t xml:space="preserve">DNSE Securities Joint Stock Company (2026) Resolutions of the 2026 annual general meeting of shareholders. Hanoi.</w:t>
+        <w:t xml:space="preserve">DNSE Securities Joint Stock Company (2026) Resolution 01/2026/NQ-DNSE-DHDCD of the 2026 annual general meeting of shareholders, 26 March 2026, and the proposals submitted to it, 23 March 2026. Hanoi.</w:t>
       </w:r>
     </w:p>
     <w:p>
@@ -22697,7 +23098,7 @@
           <w:sz w:val="21"/>
           <w:szCs w:val="21"/>
         </w:rPr>
-        <w:t xml:space="preserve">Hanoi Stock Exchange (2026) Brokerage market share of the ten largest securities companies, listed shares, UPCoM and derivatives, second quarter and first half of 2026. Announcement of 7 July 2026.</w:t>
+        <w:t xml:space="preserve">Hanoi Stock Exchange (2018 to 2026) Brokerage market share of the ten largest securities companies, listed shares, UPCoM and derivatives, quarterly announcements from the fourth quarter of 2017 to the second quarter of 2026.</w:t>
       </w:r>
     </w:p>
     <w:p>
@@ -22712,7 +23113,7 @@
           <w:sz w:val="21"/>
           <w:szCs w:val="21"/>
         </w:rPr>
-        <w:t xml:space="preserve">Ho Chi Minh Stock Exchange (2026) Brokerage market share of the ten largest securities companies, second quarter of 2026. Announcement of 7 July 2026.</w:t>
+        <w:t xml:space="preserve">Ho Chi Minh Stock Exchange (2019 to 2026) Brokerage market share of the ten largest securities companies, quarterly announcements, 2023 to the second quarter of 2026 and the fourth quarter of 2018 to the first quarter of 2019.</w:t>
       </w:r>
     </w:p>
     <w:p>
@@ -22743,21 +23144,6 @@
           <w:szCs w:val="21"/>
         </w:rPr>
         <w:t xml:space="preserve">London Stock Exchange Group (2026) FTSE Russell interim country classification review and Vietnam reclassification, effective 21 September 2026.</w:t>
-      </w:r>
-    </w:p>
-    <w:p>
-      <w:pPr>
-        <w:spacing w:after="130" w:line="280"/>
-        <w:ind w:left="420" w:hanging="420"/>
-      </w:pPr>
-      <w:r>
-        <w:rPr>
-          <w:rFonts w:ascii="Times New Roman" w:cs="Times New Roman" w:eastAsia="Times New Roman" w:hAnsi="Times New Roman"/>
-          <w:color w:val="000000"/>
-          <w:sz w:val="21"/>
-          <w:szCs w:val="21"/>
-        </w:rPr>
-        <w:t xml:space="preserve">Mekong Asean (2026) Comparison of profit across the leading securities companies, second quarter 2026. July 2026.</w:t>
       </w:r>
     </w:p>
     <w:p>
@@ -22817,7 +23203,7 @@
           <w:sz w:val="21"/>
           <w:szCs w:val="21"/>
         </w:rPr>
-        <w:t xml:space="preserve">Vietcap Securities (2026) IQ Insight financial statement data for DSE, first quarter of 2018 to second quarter of 2026. Retrieved 24 September 2026.</w:t>
+        <w:t xml:space="preserve">Vietcap Securities (2026) IQ Insight financial statement data for DSE and every securities company it covers, first quarter of 2018 to second quarter of 2026, and daily index and futures prices. Retrieved 24 September 2026 and 25 September 2026.</w:t>
       </w:r>
     </w:p>
     <w:p>
@@ -22832,7 +23218,7 @@
           <w:sz w:val="21"/>
           <w:szCs w:val="21"/>
         </w:rPr>
-        <w:t xml:space="preserve">Vietnam Securities Depository and Clearing Corporation (2026) Monthly securities account statistics, August 2026.</w:t>
+        <w:t xml:space="preserve">Vietnam Securities Depository and Clearing Corporation (2019 to 2026) Annual reports 2018 to 2025, and the investor account counter at vsd.vn, retrieved 24 September 2026.</w:t>
       </w:r>
     </w:p>
     <w:p>
@@ -22863,36 +23249,6 @@
           <w:szCs w:val="21"/>
         </w:rPr>
         <w:t xml:space="preserve">The Investor (2026) FTSE Russell names 32 Vietnamese stocks eligible for emerging-market index inclusion. 8 April 2026.</w:t>
-      </w:r>
-    </w:p>
-    <w:p>
-      <w:pPr>
-        <w:spacing w:after="130" w:line="280"/>
-        <w:ind w:left="420" w:hanging="420"/>
-      </w:pPr>
-      <w:r>
-        <w:rPr>
-          <w:rFonts w:ascii="Times New Roman" w:cs="Times New Roman" w:eastAsia="Times New Roman" w:hAnsi="Times New Roman"/>
-          <w:color w:val="000000"/>
-          <w:sz w:val="21"/>
-          <w:szCs w:val="21"/>
-        </w:rPr>
-        <w:t xml:space="preserve">Vietstock (2026) Brokerage market share on HNX and UPCoM shifts in the first half. 7 July 2026.</w:t>
-      </w:r>
-    </w:p>
-    <w:p>
-      <w:pPr>
-        <w:spacing w:after="130" w:line="280"/>
-        <w:ind w:left="420" w:hanging="420"/>
-      </w:pPr>
-      <w:r>
-        <w:rPr>
-          <w:rFonts w:ascii="Times New Roman" w:cs="Times New Roman" w:eastAsia="Times New Roman" w:hAnsi="Times New Roman"/>
-          <w:color w:val="000000"/>
-          <w:sz w:val="21"/>
-          <w:szCs w:val="21"/>
-        </w:rPr>
-        <w:t xml:space="preserve">Vietstock (2026) Derivatives market 2025: VPS loses share, DNSE leaps forward. January 2026.</w:t>
       </w:r>
     </w:p>
     <w:p>

</xml_diff>